<commit_message>
modified:   .DS_Store 	modified:   materials/.DS_Store 	modified:   materials/CISG/.DS_Store 	modified:   materials/CISG/CISG_annotated.docx 	new file:   materials/CISG/~$SG_annotated.docx 	modified:   texts/opt-advisory-opinion-notes.v7.js
</commit_message>
<xml_diff>
--- a/materials/CISG/CISG_annotated.docx
+++ b/materials/CISG/CISG_annotated.docx
@@ -249,6 +249,8 @@
       <w:pPr>
         <w:pStyle w:val="Heading2"/>
       </w:pPr>
+      <w:commentRangeStart w:id="2"/>
+      <w:commentRangeStart w:id="3"/>
       <w:r>
         <w:t>Article 6</w:t>
       </w:r>
@@ -266,6 +268,20 @@
       <w:r>
         <w:t>, derogate from or vary the effect of any of its provisions.</w:t>
       </w:r>
+      <w:commentRangeEnd w:id="2"/>
+      <w:r>
+        <w:rPr>
+          <w:rStyle w:val="CommentReference"/>
+        </w:rPr>
+        <w:commentReference w:id="2"/>
+      </w:r>
+      <w:commentRangeEnd w:id="3"/>
+      <w:r>
+        <w:rPr>
+          <w:rStyle w:val="CommentReference"/>
+        </w:rPr>
+        <w:commentReference w:id="3"/>
+      </w:r>
     </w:p>
     <w:p>
       <w:pPr>
@@ -303,6 +319,7 @@
       <w:pPr>
         <w:pStyle w:val="Heading2"/>
       </w:pPr>
+      <w:commentRangeStart w:id="4"/>
       <w:r>
         <w:t>Article 8</w:t>
       </w:r>
@@ -334,6 +351,13 @@
         <w:lastRenderedPageBreak/>
         <w:t>including the negotiations, any practices which the parties have established between themselves, usages and any subsequent conduct of the parties.</w:t>
       </w:r>
+      <w:commentRangeEnd w:id="4"/>
+      <w:r>
+        <w:rPr>
+          <w:rStyle w:val="CommentReference"/>
+        </w:rPr>
+        <w:commentReference w:id="4"/>
+      </w:r>
     </w:p>
     <w:p>
       <w:pPr>
@@ -441,6 +465,7 @@
       <w:pPr>
         <w:pStyle w:val="Heading2"/>
       </w:pPr>
+      <w:commentRangeStart w:id="5"/>
       <w:r>
         <w:t>Article 13</w:t>
       </w:r>
@@ -451,6 +476,13 @@
       </w:pPr>
       <w:r>
         <w:t>For the purposes of this Convention "writing" includes telegram and telex.</w:t>
+      </w:r>
+      <w:commentRangeEnd w:id="5"/>
+      <w:r>
+        <w:rPr>
+          <w:rStyle w:val="CommentReference"/>
+        </w:rPr>
+        <w:commentReference w:id="5"/>
       </w:r>
     </w:p>
     <w:p>
@@ -1054,6 +1086,8 @@
       <w:pPr>
         <w:pStyle w:val="Heading2"/>
       </w:pPr>
+      <w:commentRangeStart w:id="6"/>
+      <w:commentRangeStart w:id="7"/>
       <w:r>
         <w:t>Article 35</w:t>
       </w:r>
@@ -1137,110 +1171,124 @@
       <w:r>
         <w:t xml:space="preserve"> the preceding paragraph for any lack of conformity of the goods if at the time of the conclusion of the contract the buyer knew or could not have been unaware of such lack of conformity.</w:t>
       </w:r>
-    </w:p>
-    <w:p>
-      <w:pPr>
-        <w:pStyle w:val="Heading2"/>
-      </w:pPr>
-      <w:r>
-        <w:lastRenderedPageBreak/>
-        <w:t>Article 36</w:t>
-      </w:r>
-    </w:p>
-    <w:p>
-      <w:pPr>
-        <w:spacing w:after="120"/>
-      </w:pPr>
-      <w:r>
-        <w:t>(1)  The seller is liable in accordance with the contract and this Convention for any lack of conformity which exists at the time when the risk passes to the buyer, even though the lack of conformity becomes apparent only after that time.</w:t>
-      </w:r>
-    </w:p>
-    <w:p>
-      <w:pPr>
-        <w:spacing w:after="120"/>
-      </w:pPr>
-      <w:r>
-        <w:t>(2)  The seller is also liable for any lack of conformity which occurs after the time indicated in the preceding paragraph and which is due to a breach of any of his obligations, including a breach of any guarantee that for a period of time the goods will remain fit for their ordinary purpose or for some particular purpose or will retain specified qualities or characteristics.</w:t>
-      </w:r>
-    </w:p>
-    <w:p>
-      <w:pPr>
-        <w:pStyle w:val="Heading2"/>
-      </w:pPr>
-      <w:r>
-        <w:t>Article 37</w:t>
-      </w:r>
-    </w:p>
-    <w:p>
-      <w:pPr>
-        <w:spacing w:after="120"/>
-      </w:pPr>
-      <w:r>
-        <w:t>If the seller has delivered goods before the date for delivery, he may, up to that date, deliver any missing part or make up any deficiency in the quantity of the goods delivered, or deliver goods in replacement of any non-conforming goods delivered or remedy any lack of conformity in the goods delivered, provided that the exercise of this right does not cause the buyer unreasonable inconvenience or unreasonable expense. However, the buyer retains any right to claim damages as provided for in this Convention.</w:t>
-      </w:r>
-    </w:p>
-    <w:p>
-      <w:pPr>
-        <w:pStyle w:val="Heading2"/>
-      </w:pPr>
-      <w:commentRangeStart w:id="2"/>
-      <w:r>
-        <w:t>Article 38</w:t>
-      </w:r>
-    </w:p>
-    <w:p>
-      <w:pPr>
-        <w:spacing w:after="120"/>
-      </w:pPr>
-      <w:r>
-        <w:t>(1)  The buyer must examine the goods, or cause them to be examined, within as short a period as is practicable in the circumstances.</w:t>
-      </w:r>
-    </w:p>
-    <w:p>
-      <w:pPr>
-        <w:spacing w:after="120"/>
-      </w:pPr>
-      <w:r>
-        <w:t>(2)  If the contract involves carriage of the goods, examination may be deferred until after the goods have arrived at their destination.</w:t>
-      </w:r>
-    </w:p>
-    <w:p>
-      <w:pPr>
-        <w:spacing w:after="120"/>
-      </w:pPr>
-      <w:r>
-        <w:t>(3)  If the goods are redirected in transit or redispatched by the buyer without a reasonable opportunity for examination by him and at the time of the conclusion of the contract the seller knew or ought to have known of the possibility of such redirection or redispatch, examination may be deferred until after the goods have arrived at the new destination.</w:t>
-      </w:r>
-    </w:p>
-    <w:p>
-      <w:pPr>
-        <w:pStyle w:val="Heading2"/>
-      </w:pPr>
-      <w:r>
-        <w:t>Article 39</w:t>
-      </w:r>
-    </w:p>
-    <w:p>
-      <w:pPr>
-        <w:spacing w:after="120"/>
-      </w:pPr>
-      <w:r>
-        <w:t>(1)  The buyer loses the right to rely on a lack of conformity of the goods if he does not give notice to the seller specifying the nature of the lack of conformity within a reasonable time after he has discovered it or ought to have discovered it.</w:t>
-      </w:r>
-    </w:p>
-    <w:p>
-      <w:pPr>
-        <w:spacing w:after="120"/>
-      </w:pPr>
-      <w:r>
-        <w:t>(2)  In any event, the buyer loses the right to rely on a lack of conformity of the goods if he does not give the seller notice thereof at the latest within a period of two years from the date on which the goods were actually handed over to the buyer, unless this time-limit is inconsistent with a contractual period of guarantee.</w:t>
-      </w:r>
-      <w:commentRangeEnd w:id="2"/>
+      <w:commentRangeEnd w:id="6"/>
       <w:r>
         <w:rPr>
           <w:rStyle w:val="CommentReference"/>
         </w:rPr>
-        <w:commentReference w:id="2"/>
+        <w:commentReference w:id="6"/>
+      </w:r>
+      <w:commentRangeEnd w:id="7"/>
+      <w:r>
+        <w:rPr>
+          <w:rStyle w:val="CommentReference"/>
+        </w:rPr>
+        <w:commentReference w:id="7"/>
+      </w:r>
+    </w:p>
+    <w:p>
+      <w:pPr>
+        <w:pStyle w:val="Heading2"/>
+      </w:pPr>
+      <w:r>
+        <w:lastRenderedPageBreak/>
+        <w:t>Article 36</w:t>
+      </w:r>
+    </w:p>
+    <w:p>
+      <w:pPr>
+        <w:spacing w:after="120"/>
+      </w:pPr>
+      <w:r>
+        <w:t>(1)  The seller is liable in accordance with the contract and this Convention for any lack of conformity which exists at the time when the risk passes to the buyer, even though the lack of conformity becomes apparent only after that time.</w:t>
+      </w:r>
+    </w:p>
+    <w:p>
+      <w:pPr>
+        <w:spacing w:after="120"/>
+      </w:pPr>
+      <w:r>
+        <w:t>(2)  The seller is also liable for any lack of conformity which occurs after the time indicated in the preceding paragraph and which is due to a breach of any of his obligations, including a breach of any guarantee that for a period of time the goods will remain fit for their ordinary purpose or for some particular purpose or will retain specified qualities or characteristics.</w:t>
+      </w:r>
+    </w:p>
+    <w:p>
+      <w:pPr>
+        <w:pStyle w:val="Heading2"/>
+      </w:pPr>
+      <w:r>
+        <w:t>Article 37</w:t>
+      </w:r>
+    </w:p>
+    <w:p>
+      <w:pPr>
+        <w:spacing w:after="120"/>
+      </w:pPr>
+      <w:r>
+        <w:t>If the seller has delivered goods before the date for delivery, he may, up to that date, deliver any missing part or make up any deficiency in the quantity of the goods delivered, or deliver goods in replacement of any non-conforming goods delivered or remedy any lack of conformity in the goods delivered, provided that the exercise of this right does not cause the buyer unreasonable inconvenience or unreasonable expense. However, the buyer retains any right to claim damages as provided for in this Convention.</w:t>
+      </w:r>
+    </w:p>
+    <w:p>
+      <w:pPr>
+        <w:pStyle w:val="Heading2"/>
+      </w:pPr>
+      <w:commentRangeStart w:id="8"/>
+      <w:r>
+        <w:t>Article 38</w:t>
+      </w:r>
+    </w:p>
+    <w:p>
+      <w:pPr>
+        <w:spacing w:after="120"/>
+      </w:pPr>
+      <w:r>
+        <w:t>(1)  The buyer must examine the goods, or cause them to be examined, within as short a period as is practicable in the circumstances.</w:t>
+      </w:r>
+    </w:p>
+    <w:p>
+      <w:pPr>
+        <w:spacing w:after="120"/>
+      </w:pPr>
+      <w:r>
+        <w:t>(2)  If the contract involves carriage of the goods, examination may be deferred until after the goods have arrived at their destination.</w:t>
+      </w:r>
+    </w:p>
+    <w:p>
+      <w:pPr>
+        <w:spacing w:after="120"/>
+      </w:pPr>
+      <w:r>
+        <w:t>(3)  If the goods are redirected in transit or redispatched by the buyer without a reasonable opportunity for examination by him and at the time of the conclusion of the contract the seller knew or ought to have known of the possibility of such redirection or redispatch, examination may be deferred until after the goods have arrived at the new destination.</w:t>
+      </w:r>
+    </w:p>
+    <w:p>
+      <w:pPr>
+        <w:pStyle w:val="Heading2"/>
+      </w:pPr>
+      <w:r>
+        <w:t>Article 39</w:t>
+      </w:r>
+    </w:p>
+    <w:p>
+      <w:pPr>
+        <w:spacing w:after="120"/>
+      </w:pPr>
+      <w:r>
+        <w:t>(1)  The buyer loses the right to rely on a lack of conformity of the goods if he does not give notice to the seller specifying the nature of the lack of conformity within a reasonable time after he has discovered it or ought to have discovered it.</w:t>
+      </w:r>
+    </w:p>
+    <w:p>
+      <w:pPr>
+        <w:spacing w:after="120"/>
+      </w:pPr>
+      <w:r>
+        <w:t>(2)  In any event, the buyer loses the right to rely on a lack of conformity of the goods if he does not give the seller notice thereof at the latest within a period of two years from the date on which the goods were actually handed over to the buyer, unless this time-limit is inconsistent with a contractual period of guarantee.</w:t>
+      </w:r>
+      <w:commentRangeEnd w:id="8"/>
+      <w:r>
+        <w:rPr>
+          <w:rStyle w:val="CommentReference"/>
+        </w:rPr>
+        <w:commentReference w:id="8"/>
       </w:r>
     </w:p>
     <w:p>
@@ -1635,8 +1683,16 @@
         <w:spacing w:after="120"/>
         <w:ind w:left="432"/>
       </w:pPr>
+      <w:commentRangeStart w:id="9"/>
       <w:r>
         <w:t>(a)  if the failure by the seller to perform any of his obligations under the contract or this Convention amounts to a fundamental breach of contract; or</w:t>
+      </w:r>
+      <w:commentRangeEnd w:id="9"/>
+      <w:r>
+        <w:rPr>
+          <w:rStyle w:val="CommentReference"/>
+        </w:rPr>
+        <w:commentReference w:id="9"/>
       </w:r>
     </w:p>
     <w:p>
@@ -2621,6 +2677,7 @@
       <w:pPr>
         <w:pStyle w:val="Heading2"/>
       </w:pPr>
+      <w:commentRangeStart w:id="10"/>
       <w:r>
         <w:t>Article 74</w:t>
       </w:r>
@@ -2631,6 +2688,13 @@
       </w:pPr>
       <w:r>
         <w:t>Damages for breach of contract by one party consist of a sum equal to the loss, including loss of profit, suffered by the other party as a consequence of the breach. Such damages may not exceed the loss which the party in breach foresaw or ought to have foreseen at the time of the conclusion of the contract, in the light of the facts and matters of which he then knew or ought to have known, as a possible consequence of the breach of contract.</w:t>
+      </w:r>
+      <w:commentRangeEnd w:id="10"/>
+      <w:r>
+        <w:rPr>
+          <w:rStyle w:val="CommentReference"/>
+        </w:rPr>
+        <w:commentReference w:id="10"/>
       </w:r>
     </w:p>
     <w:p>
@@ -3818,7 +3882,194 @@
       </w:r>
     </w:p>
   </w:comment>
-  <w:comment w:id="2" w:author="Oscar Pearce" w:date="2025-10-04T16:27:00Z" w:initials="OP">
+  <w:comment w:id="2" w:author="Oscar Pearce" w:date="2025-10-05T15:42:00Z" w:initials="OP">
+    <w:p>
+      <w:r>
+        <w:rPr>
+          <w:rStyle w:val="CommentReference"/>
+        </w:rPr>
+        <w:annotationRef/>
+      </w:r>
+      <w:r>
+        <w:rPr>
+          <w:sz w:val="20"/>
+          <w:szCs w:val="20"/>
+        </w:rPr>
+        <w:t xml:space="preserve">See CISG Advisory Council Opinion No 16 for a comprehensive analysis of this provision: </w:t>
+      </w:r>
+      <w:hyperlink r:id="rId3" w:history="1">
+        <w:r>
+          <w:rPr>
+            <w:rStyle w:val="Hyperlink"/>
+            <w:sz w:val="20"/>
+            <w:szCs w:val="20"/>
+          </w:rPr>
+          <w:t>https://cisgac.com/opinions/cisgac-opinion-no-16/</w:t>
+        </w:r>
+      </w:hyperlink>
+      <w:r>
+        <w:rPr>
+          <w:sz w:val="20"/>
+          <w:szCs w:val="20"/>
+        </w:rPr>
+        <w:t>.</w:t>
+      </w:r>
+    </w:p>
+  </w:comment>
+  <w:comment w:id="3" w:author="Oscar Pearce" w:date="2025-10-05T15:42:00Z" w:initials="OP">
+    <w:p>
+      <w:r>
+        <w:rPr>
+          <w:rStyle w:val="CommentReference"/>
+        </w:rPr>
+        <w:annotationRef/>
+      </w:r>
+      <w:r>
+        <w:rPr>
+          <w:sz w:val="20"/>
+          <w:szCs w:val="20"/>
+        </w:rPr>
+        <w:t xml:space="preserve">See also CISG Advisory Council Opinion No 3 for the application of this provision to merger clauses: </w:t>
+      </w:r>
+      <w:hyperlink r:id="rId4" w:history="1">
+        <w:r>
+          <w:rPr>
+            <w:rStyle w:val="Hyperlink"/>
+            <w:sz w:val="20"/>
+            <w:szCs w:val="20"/>
+          </w:rPr>
+          <w:t>https://cisgac.com/opinions/cisgac-opinion-no-3/</w:t>
+        </w:r>
+      </w:hyperlink>
+      <w:r>
+        <w:rPr>
+          <w:sz w:val="20"/>
+          <w:szCs w:val="20"/>
+        </w:rPr>
+        <w:t>. In short, 'specific wording' is needed to derogate from the general interpretation rules in Article 8.</w:t>
+      </w:r>
+    </w:p>
+  </w:comment>
+  <w:comment w:id="4" w:author="Oscar Pearce" w:date="2025-10-05T15:47:00Z" w:initials="OP">
+    <w:p>
+      <w:r>
+        <w:rPr>
+          <w:rStyle w:val="CommentReference"/>
+        </w:rPr>
+        <w:annotationRef/>
+      </w:r>
+      <w:r>
+        <w:rPr>
+          <w:sz w:val="20"/>
+          <w:szCs w:val="20"/>
+        </w:rPr>
+        <w:t xml:space="preserve">Note that the CISG has this bespoke interpretation regime, and does not incorporate the Parol Evidence Rule. On the latter, see CISG Advisory Council Opinion No 3: </w:t>
+      </w:r>
+      <w:hyperlink r:id="rId5" w:history="1">
+        <w:r>
+          <w:rPr>
+            <w:rStyle w:val="Hyperlink"/>
+            <w:sz w:val="20"/>
+            <w:szCs w:val="20"/>
+          </w:rPr>
+          <w:t>https://cisgac.com/opinions/cisgac-opinion-no-3/</w:t>
+        </w:r>
+      </w:hyperlink>
+      <w:r>
+        <w:rPr>
+          <w:sz w:val="20"/>
+          <w:szCs w:val="20"/>
+        </w:rPr>
+        <w:t>.</w:t>
+      </w:r>
+    </w:p>
+  </w:comment>
+  <w:comment w:id="5" w:author="Oscar Pearce" w:date="2025-10-05T15:49:00Z" w:initials="OP">
+    <w:p>
+      <w:r>
+        <w:rPr>
+          <w:rStyle w:val="CommentReference"/>
+        </w:rPr>
+        <w:annotationRef/>
+      </w:r>
+      <w:r>
+        <w:rPr>
+          <w:sz w:val="20"/>
+          <w:szCs w:val="20"/>
+        </w:rPr>
+        <w:t xml:space="preserve">See CISG Advisory Council Opinion No 1 for the further extension of "writing" to include electronic communication: </w:t>
+      </w:r>
+      <w:hyperlink r:id="rId6" w:history="1">
+        <w:r>
+          <w:rPr>
+            <w:rStyle w:val="Hyperlink"/>
+            <w:sz w:val="20"/>
+            <w:szCs w:val="20"/>
+          </w:rPr>
+          <w:t>https://cisgac.com/opinions/cisgac-opinion-no-1/</w:t>
+        </w:r>
+      </w:hyperlink>
+      <w:r>
+        <w:rPr>
+          <w:sz w:val="20"/>
+          <w:szCs w:val="20"/>
+        </w:rPr>
+        <w:t>.</w:t>
+      </w:r>
+    </w:p>
+  </w:comment>
+  <w:comment w:id="6" w:author="Oscar Pearce" w:date="2025-10-05T15:52:00Z" w:initials="OP">
+    <w:p>
+      <w:r>
+        <w:rPr>
+          <w:rStyle w:val="CommentReference"/>
+        </w:rPr>
+        <w:annotationRef/>
+      </w:r>
+      <w:r>
+        <w:rPr>
+          <w:sz w:val="20"/>
+          <w:szCs w:val="20"/>
+        </w:rPr>
+        <w:t>[19]</w:t>
+      </w:r>
+    </w:p>
+  </w:comment>
+  <w:comment w:id="7" w:author="Oscar Pearce" w:date="2025-10-05T15:52:00Z" w:initials="OP">
+    <w:p>
+      <w:r>
+        <w:rPr>
+          <w:rStyle w:val="CommentReference"/>
+        </w:rPr>
+        <w:annotationRef/>
+      </w:r>
+      <w:r>
+        <w:rPr>
+          <w:sz w:val="20"/>
+          <w:szCs w:val="20"/>
+        </w:rPr>
+        <w:t xml:space="preserve">See also CISG Advisory Council Opinion No 5 for a discussion of the criteria required for non-conformity to amount to a fundamental breach creating a right of avoidance: </w:t>
+      </w:r>
+      <w:hyperlink r:id="rId7" w:history="1">
+        <w:r>
+          <w:rPr>
+            <w:rStyle w:val="Hyperlink"/>
+            <w:sz w:val="20"/>
+            <w:szCs w:val="20"/>
+          </w:rPr>
+          <w:t>https://cisgac.com/opinions/cisgac-opinion-no-5/</w:t>
+        </w:r>
+      </w:hyperlink>
+      <w:r>
+        <w:rPr>
+          <w:sz w:val="20"/>
+          <w:szCs w:val="20"/>
+        </w:rPr>
+        <w:t>.</w:t>
+      </w:r>
+    </w:p>
+  </w:comment>
+  <w:comment w:id="8" w:author="Oscar Pearce" w:date="2025-10-04T16:27:00Z" w:initials="OP">
     <w:p>
       <w:r>
         <w:rPr>
@@ -3833,7 +4084,7 @@
         </w:rPr>
         <w:t xml:space="preserve">See CISG Advisory Council Opinion No 2 for a comprehensive analysis of these provisions: </w:t>
       </w:r>
-      <w:hyperlink r:id="rId3" w:history="1">
+      <w:hyperlink r:id="rId8" w:history="1">
         <w:r>
           <w:rPr>
             <w:rStyle w:val="Hyperlink"/>
@@ -3852,6 +4103,74 @@
       </w:r>
     </w:p>
   </w:comment>
+  <w:comment w:id="9" w:author="Oscar Pearce" w:date="2025-10-05T15:52:00Z" w:initials="OP">
+    <w:p>
+      <w:r>
+        <w:rPr>
+          <w:rStyle w:val="CommentReference"/>
+        </w:rPr>
+        <w:annotationRef/>
+      </w:r>
+      <w:r>
+        <w:rPr>
+          <w:sz w:val="20"/>
+          <w:szCs w:val="20"/>
+        </w:rPr>
+        <w:t xml:space="preserve">See CISG Advisory Council Opinion No 5 for a discussion of the criteria required for non-conformity to amount to a fundamental breach: </w:t>
+      </w:r>
+      <w:hyperlink r:id="rId9" w:history="1">
+        <w:r>
+          <w:rPr>
+            <w:rStyle w:val="Hyperlink"/>
+            <w:sz w:val="20"/>
+            <w:szCs w:val="20"/>
+          </w:rPr>
+          <w:t>https://cisgac.com/opinions/cisgac-opinion-no-5/</w:t>
+        </w:r>
+      </w:hyperlink>
+      <w:r>
+        <w:rPr>
+          <w:sz w:val="20"/>
+          <w:szCs w:val="20"/>
+        </w:rPr>
+        <w:t>.</w:t>
+      </w:r>
+    </w:p>
+  </w:comment>
+  <w:comment w:id="10" w:author="Oscar Pearce" w:date="2025-10-05T15:53:00Z" w:initials="OP">
+    <w:p>
+      <w:r>
+        <w:rPr>
+          <w:rStyle w:val="CommentReference"/>
+        </w:rPr>
+        <w:annotationRef/>
+      </w:r>
+      <w:r>
+        <w:rPr>
+          <w:sz w:val="20"/>
+          <w:szCs w:val="20"/>
+        </w:rPr>
+        <w:t xml:space="preserve">See CISG Advisory Council Opinion No 6 for a comprehensive analysis of this provision: </w:t>
+      </w:r>
+      <w:hyperlink r:id="rId10" w:history="1">
+        <w:r>
+          <w:rPr>
+            <w:rStyle w:val="Hyperlink"/>
+            <w:sz w:val="20"/>
+            <w:szCs w:val="20"/>
+          </w:rPr>
+          <w:t>https://cisgac.com/opinions/cisgac-opinion-no-6/</w:t>
+        </w:r>
+      </w:hyperlink>
+      <w:r>
+        <w:rPr>
+          <w:sz w:val="20"/>
+          <w:szCs w:val="20"/>
+        </w:rPr>
+        <w:t>.</w:t>
+      </w:r>
+    </w:p>
+  </w:comment>
 </w:comments>
 </file>
 
@@ -3859,7 +4178,15 @@
 <w15:commentsEx xmlns:wpc="http://schemas.microsoft.com/office/word/2010/wordprocessingCanvas" xmlns:cx="http://schemas.microsoft.com/office/drawing/2014/chartex" xmlns:cx1="http://schemas.microsoft.com/office/drawing/2015/9/8/chartex" xmlns:cx2="http://schemas.microsoft.com/office/drawing/2015/10/21/chartex" xmlns:cx3="http://schemas.microsoft.com/office/drawing/2016/5/9/chartex" xmlns:cx4="http://schemas.microsoft.com/office/drawing/2016/5/10/chartex" xmlns:cx5="http://schemas.microsoft.com/office/drawing/2016/5/11/chartex" xmlns:cx6="http://schemas.microsoft.com/office/drawing/2016/5/12/chartex" xmlns:cx7="http://schemas.microsoft.com/office/drawing/2016/5/13/chartex" xmlns:cx8="http://schemas.microsoft.com/office/drawing/2016/5/14/chartex" xmlns:mc="http://schemas.openxmlformats.org/markup-compatibility/2006" xmlns:aink="http://schemas.microsoft.com/office/drawing/2016/ink" xmlns:am3d="http://schemas.microsoft.com/office/drawing/2017/model3d" xmlns:o="urn:schemas-microsoft-com:office:office" xmlns:oel="http://schemas.microsoft.com/office/2019/extlst" xmlns:r="http://schemas.openxmlformats.org/officeDocument/2006/relationships" xmlns:m="http://schemas.openxmlformats.org/officeDocument/2006/math" xmlns:v="urn:schemas-microsoft-com:vml" xmlns:wp14="http://schemas.microsoft.com/office/word/2010/wordprocessingDrawing" xmlns:wp="http://schemas.openxmlformats.org/drawingml/2006/wordprocessingDrawing" xmlns:w10="urn:schemas-microsoft-com:office:word" xmlns:w="http://schemas.openxmlformats.org/wordprocessingml/2006/main" xmlns:w14="http://schemas.microsoft.com/office/word/2010/wordml" xmlns:w15="http://schemas.microsoft.com/office/word/2012/wordml" xmlns:w16cex="http://schemas.microsoft.com/office/word/2018/wordml/cex" xmlns:w16cid="http://schemas.microsoft.com/office/word/2016/wordml/cid" xmlns:w16="http://schemas.microsoft.com/office/word/2018/wordml" xmlns:w16du="http://schemas.microsoft.com/office/word/2023/wordml/word16du" xmlns:w16sdtdh="http://schemas.microsoft.com/office/word/2020/wordml/sdtdatahash" xmlns:w16sdtfl="http://schemas.microsoft.com/office/word/2024/wordml/sdtformatlock" xmlns:w16se="http://schemas.microsoft.com/office/word/2015/wordml/symex" xmlns:wpg="http://schemas.microsoft.com/office/word/2010/wordprocessingGroup" xmlns:wpi="http://schemas.microsoft.com/office/word/2010/wordprocessingInk" xmlns:wne="http://schemas.microsoft.com/office/word/2006/wordml" xmlns:wps="http://schemas.microsoft.com/office/word/2010/wordprocessingShape" mc:Ignorable="w14 w15 w16se w16cid w16 w16cex w16sdtdh w16sdtfl w16du wp14">
   <w15:commentEx w15:paraId="332714E0" w15:done="0"/>
   <w15:commentEx w15:paraId="69C9008F" w15:done="0"/>
+  <w15:commentEx w15:paraId="15798C36" w15:done="0"/>
+  <w15:commentEx w15:paraId="026A144A" w15:paraIdParent="15798C36" w15:done="0"/>
+  <w15:commentEx w15:paraId="54A93DE9" w15:done="0"/>
+  <w15:commentEx w15:paraId="167B32F1" w15:done="0"/>
+  <w15:commentEx w15:paraId="6D1B7673" w15:done="0"/>
+  <w15:commentEx w15:paraId="684CDBA5" w15:paraIdParent="6D1B7673" w15:done="0"/>
   <w15:commentEx w15:paraId="687E6E52" w15:done="0"/>
+  <w15:commentEx w15:paraId="74FAE5DA" w15:done="0"/>
+  <w15:commentEx w15:paraId="6E863AC0" w15:done="0"/>
 </w15:commentsEx>
 </file>
 
@@ -3867,7 +4194,15 @@
 <w16cex:commentsExtensible xmlns:wpc="http://schemas.microsoft.com/office/word/2010/wordprocessingCanvas" xmlns:cx="http://schemas.microsoft.com/office/drawing/2014/chartex" xmlns:cx1="http://schemas.microsoft.com/office/drawing/2015/9/8/chartex" xmlns:cx2="http://schemas.microsoft.com/office/drawing/2015/10/21/chartex" xmlns:cx3="http://schemas.microsoft.com/office/drawing/2016/5/9/chartex" xmlns:cx4="http://schemas.microsoft.com/office/drawing/2016/5/10/chartex" xmlns:cx5="http://schemas.microsoft.com/office/drawing/2016/5/11/chartex" xmlns:cx6="http://schemas.microsoft.com/office/drawing/2016/5/12/chartex" xmlns:cx7="http://schemas.microsoft.com/office/drawing/2016/5/13/chartex" xmlns:cx8="http://schemas.microsoft.com/office/drawing/2016/5/14/chartex" xmlns:cr="http://schemas.microsoft.com/office/comments/2020/reactions" xmlns:mc="http://schemas.openxmlformats.org/markup-compatibility/2006" xmlns:aink="http://schemas.microsoft.com/office/drawing/2016/ink" xmlns:am3d="http://schemas.microsoft.com/office/drawing/2017/model3d" xmlns:o="urn:schemas-microsoft-com:office:office" xmlns:oel="http://schemas.microsoft.com/office/2019/extlst" xmlns:r="http://schemas.openxmlformats.org/officeDocument/2006/relationships" xmlns:m="http://schemas.openxmlformats.org/officeDocument/2006/math" xmlns:v="urn:schemas-microsoft-com:vml" xmlns:wp14="http://schemas.microsoft.com/office/word/2010/wordprocessingDrawing" xmlns:wp="http://schemas.openxmlformats.org/drawingml/2006/wordprocessingDrawing" xmlns:w10="urn:schemas-microsoft-com:office:word" xmlns:w="http://schemas.openxmlformats.org/wordprocessingml/2006/main" xmlns:w14="http://schemas.microsoft.com/office/word/2010/wordml" xmlns:w15="http://schemas.microsoft.com/office/word/2012/wordml" xmlns:w16cex="http://schemas.microsoft.com/office/word/2018/wordml/cex" xmlns:w16cid="http://schemas.microsoft.com/office/word/2016/wordml/cid" xmlns:w16="http://schemas.microsoft.com/office/word/2018/wordml" xmlns:w16du="http://schemas.microsoft.com/office/word/2023/wordml/word16du" xmlns:w16sdtdh="http://schemas.microsoft.com/office/word/2020/wordml/sdtdatahash" xmlns:w16sdtfl="http://schemas.microsoft.com/office/word/2024/wordml/sdtformatlock" xmlns:w16se="http://schemas.microsoft.com/office/word/2015/wordml/symex" xmlns:wpg="http://schemas.microsoft.com/office/word/2010/wordprocessingGroup" xmlns:wpi="http://schemas.microsoft.com/office/word/2010/wordprocessingInk" xmlns:wne="http://schemas.microsoft.com/office/word/2006/wordml" xmlns:wps="http://schemas.microsoft.com/office/word/2010/wordprocessingShape" mc:Ignorable="w14 w15 w16se w16cid w16 w16cex w16sdtdh w16sdtfl cr w16du wp14">
   <w16cex:commentExtensible w16cex:durableId="59C8E37A" w16cex:dateUtc="2025-10-04T05:25:00Z"/>
   <w16cex:commentExtensible w16cex:durableId="25B206B4" w16cex:dateUtc="2025-10-04T05:18:00Z"/>
+  <w16cex:commentExtensible w16cex:durableId="21E06797" w16cex:dateUtc="2025-10-05T04:42:00Z"/>
+  <w16cex:commentExtensible w16cex:durableId="288364BD" w16cex:dateUtc="2025-10-05T04:42:00Z"/>
+  <w16cex:commentExtensible w16cex:durableId="04BDA365" w16cex:dateUtc="2025-10-05T04:47:00Z"/>
+  <w16cex:commentExtensible w16cex:durableId="78727D23" w16cex:dateUtc="2025-10-05T04:49:00Z"/>
+  <w16cex:commentExtensible w16cex:durableId="521AF3BD" w16cex:dateUtc="2025-10-05T04:52:00Z"/>
+  <w16cex:commentExtensible w16cex:durableId="25E83FAC" w16cex:dateUtc="2025-10-05T04:52:00Z"/>
   <w16cex:commentExtensible w16cex:durableId="5C65860E" w16cex:dateUtc="2025-10-04T06:27:00Z"/>
+  <w16cex:commentExtensible w16cex:durableId="75A4D186" w16cex:dateUtc="2025-10-05T04:52:00Z"/>
+  <w16cex:commentExtensible w16cex:durableId="5FB4EFCC" w16cex:dateUtc="2025-10-05T04:53:00Z"/>
 </w16cex:commentsExtensible>
 </file>
 
@@ -3875,7 +4210,15 @@
 <w16cid:commentsIds xmlns:wpc="http://schemas.microsoft.com/office/word/2010/wordprocessingCanvas" xmlns:cx="http://schemas.microsoft.com/office/drawing/2014/chartex" xmlns:cx1="http://schemas.microsoft.com/office/drawing/2015/9/8/chartex" xmlns:cx2="http://schemas.microsoft.com/office/drawing/2015/10/21/chartex" xmlns:cx3="http://schemas.microsoft.com/office/drawing/2016/5/9/chartex" xmlns:cx4="http://schemas.microsoft.com/office/drawing/2016/5/10/chartex" xmlns:cx5="http://schemas.microsoft.com/office/drawing/2016/5/11/chartex" xmlns:cx6="http://schemas.microsoft.com/office/drawing/2016/5/12/chartex" xmlns:cx7="http://schemas.microsoft.com/office/drawing/2016/5/13/chartex" xmlns:cx8="http://schemas.microsoft.com/office/drawing/2016/5/14/chartex" xmlns:mc="http://schemas.openxmlformats.org/markup-compatibility/2006" xmlns:aink="http://schemas.microsoft.com/office/drawing/2016/ink" xmlns:am3d="http://schemas.microsoft.com/office/drawing/2017/model3d" xmlns:o="urn:schemas-microsoft-com:office:office" xmlns:oel="http://schemas.microsoft.com/office/2019/extlst" xmlns:r="http://schemas.openxmlformats.org/officeDocument/2006/relationships" xmlns:m="http://schemas.openxmlformats.org/officeDocument/2006/math" xmlns:v="urn:schemas-microsoft-com:vml" xmlns:wp14="http://schemas.microsoft.com/office/word/2010/wordprocessingDrawing" xmlns:wp="http://schemas.openxmlformats.org/drawingml/2006/wordprocessingDrawing" xmlns:w10="urn:schemas-microsoft-com:office:word" xmlns:w="http://schemas.openxmlformats.org/wordprocessingml/2006/main" xmlns:w14="http://schemas.microsoft.com/office/word/2010/wordml" xmlns:w15="http://schemas.microsoft.com/office/word/2012/wordml" xmlns:w16cex="http://schemas.microsoft.com/office/word/2018/wordml/cex" xmlns:w16cid="http://schemas.microsoft.com/office/word/2016/wordml/cid" xmlns:w16="http://schemas.microsoft.com/office/word/2018/wordml" xmlns:w16du="http://schemas.microsoft.com/office/word/2023/wordml/word16du" xmlns:w16sdtdh="http://schemas.microsoft.com/office/word/2020/wordml/sdtdatahash" xmlns:w16sdtfl="http://schemas.microsoft.com/office/word/2024/wordml/sdtformatlock" xmlns:w16se="http://schemas.microsoft.com/office/word/2015/wordml/symex" xmlns:wpg="http://schemas.microsoft.com/office/word/2010/wordprocessingGroup" xmlns:wpi="http://schemas.microsoft.com/office/word/2010/wordprocessingInk" xmlns:wne="http://schemas.microsoft.com/office/word/2006/wordml" xmlns:wps="http://schemas.microsoft.com/office/word/2010/wordprocessingShape" mc:Ignorable="w14 w15 w16se w16cid w16 w16cex w16sdtdh w16sdtfl w16du wp14">
   <w16cid:commentId w16cid:paraId="332714E0" w16cid:durableId="59C8E37A"/>
   <w16cid:commentId w16cid:paraId="69C9008F" w16cid:durableId="25B206B4"/>
+  <w16cid:commentId w16cid:paraId="15798C36" w16cid:durableId="21E06797"/>
+  <w16cid:commentId w16cid:paraId="026A144A" w16cid:durableId="288364BD"/>
+  <w16cid:commentId w16cid:paraId="54A93DE9" w16cid:durableId="04BDA365"/>
+  <w16cid:commentId w16cid:paraId="167B32F1" w16cid:durableId="78727D23"/>
+  <w16cid:commentId w16cid:paraId="6D1B7673" w16cid:durableId="521AF3BD"/>
+  <w16cid:commentId w16cid:paraId="684CDBA5" w16cid:durableId="25E83FAC"/>
   <w16cid:commentId w16cid:paraId="687E6E52" w16cid:durableId="5C65860E"/>
+  <w16cid:commentId w16cid:paraId="74FAE5DA" w16cid:durableId="75A4D186"/>
+  <w16cid:commentId w16cid:paraId="6E863AC0" w16cid:durableId="5FB4EFCC"/>
 </w16cid:commentsIds>
 </file>
 

</xml_diff>

<commit_message>
modified:   .DS_Store 	modified:   index.html 	modified:   materials/.DS_Store 	modified:   materials/CISG/CISG_annotated.docx 	modified:   texts/all.html 	new file:   texts/cisg-notes.js 	new file:   texts/cisg.html 	modified:   texts/nicaragua-germany.html 	modified:   texts/opt-advisory-opinion.html
</commit_message>
<xml_diff>
--- a/materials/CISG/CISG_annotated.docx
+++ b/materials/CISG/CISG_annotated.docx
@@ -233,6 +233,7 @@
       <w:pPr>
         <w:pStyle w:val="Heading2"/>
       </w:pPr>
+      <w:commentRangeStart w:id="2"/>
       <w:r>
         <w:t>Article 5</w:t>
       </w:r>
@@ -243,30 +244,6 @@
       </w:pPr>
       <w:r>
         <w:t>This Convention does not apply to the liability of the seller for death or personal injury caused by the goods to any person.</w:t>
-      </w:r>
-    </w:p>
-    <w:p>
-      <w:pPr>
-        <w:pStyle w:val="Heading2"/>
-      </w:pPr>
-      <w:commentRangeStart w:id="2"/>
-      <w:commentRangeStart w:id="3"/>
-      <w:r>
-        <w:t>Article 6</w:t>
-      </w:r>
-    </w:p>
-    <w:p>
-      <w:pPr>
-        <w:spacing w:after="120"/>
-      </w:pPr>
-      <w:r>
-        <w:t>The parties may exclude the application of this Convention or, subject to</w:t>
-      </w:r>
-      <w:r>
-        <w:t xml:space="preserve"> article 12</w:t>
-      </w:r>
-      <w:r>
-        <w:t>, derogate from or vary the effect of any of its provisions.</w:t>
       </w:r>
       <w:commentRangeEnd w:id="2"/>
       <w:r>
@@ -275,6 +252,31 @@
         </w:rPr>
         <w:commentReference w:id="2"/>
       </w:r>
+    </w:p>
+    <w:p>
+      <w:pPr>
+        <w:pStyle w:val="Heading2"/>
+      </w:pPr>
+      <w:commentRangeStart w:id="3"/>
+      <w:commentRangeStart w:id="4"/>
+      <w:commentRangeStart w:id="5"/>
+      <w:r>
+        <w:t>Article 6</w:t>
+      </w:r>
+    </w:p>
+    <w:p>
+      <w:pPr>
+        <w:spacing w:after="120"/>
+      </w:pPr>
+      <w:r>
+        <w:t>The parties may exclude the application of this Convention or, subject to</w:t>
+      </w:r>
+      <w:r>
+        <w:t xml:space="preserve"> article 12</w:t>
+      </w:r>
+      <w:r>
+        <w:t>, derogate from or vary the effect of any of its provisions.</w:t>
+      </w:r>
       <w:commentRangeEnd w:id="3"/>
       <w:r>
         <w:rPr>
@@ -282,75 +284,6 @@
         </w:rPr>
         <w:commentReference w:id="3"/>
       </w:r>
-    </w:p>
-    <w:p>
-      <w:pPr>
-        <w:pStyle w:val="Heading2"/>
-      </w:pPr>
-      <w:r>
-        <w:t>CHAPTER II. GENERAL PROVISIONS</w:t>
-      </w:r>
-    </w:p>
-    <w:p>
-      <w:pPr>
-        <w:pStyle w:val="Heading2"/>
-      </w:pPr>
-      <w:r>
-        <w:t>Article 7</w:t>
-      </w:r>
-    </w:p>
-    <w:p>
-      <w:pPr>
-        <w:spacing w:after="120"/>
-      </w:pPr>
-      <w:r>
-        <w:t>(1)  In the interpretation of this Convention, regard is to be had to its international character and to the need to promote uniformity in its application and the observance of good faith in international trade.</w:t>
-      </w:r>
-    </w:p>
-    <w:p>
-      <w:pPr>
-        <w:spacing w:after="120"/>
-      </w:pPr>
-      <w:r>
-        <w:t>(2)  Questions concerning matters governed by this Convention which are not expressly settled in it are to be settled in conformity with the general principles on which it is based or, in the absence of such principles, in conformity with the law applicable by virtue of the rules of private international law.</w:t>
-      </w:r>
-    </w:p>
-    <w:p>
-      <w:pPr>
-        <w:pStyle w:val="Heading2"/>
-      </w:pPr>
-      <w:commentRangeStart w:id="4"/>
-      <w:r>
-        <w:t>Article 8</w:t>
-      </w:r>
-    </w:p>
-    <w:p>
-      <w:pPr>
-        <w:spacing w:after="120"/>
-      </w:pPr>
-      <w:r>
-        <w:t>(1)  For the purposes of this Convention statements made by and other conduct of a party are to be interpreted according to his intent where the other party knew or could not have been unaware what that intent was.</w:t>
-      </w:r>
-    </w:p>
-    <w:p>
-      <w:pPr>
-        <w:spacing w:after="120"/>
-      </w:pPr>
-      <w:r>
-        <w:t>(2)  If the preceding paragraph is not applicable, statements made by and other conduct of a party are to be interpreted according to the understanding that a reasonable person of the same kind as the other party would have had in the same circumstances.</w:t>
-      </w:r>
-    </w:p>
-    <w:p>
-      <w:pPr>
-        <w:spacing w:after="120"/>
-      </w:pPr>
-      <w:r>
-        <w:t xml:space="preserve">(3)  In determining the intent of a party or the understanding a reasonable person would have had, due consideration is to be given to all relevant circumstances of the case </w:t>
-      </w:r>
-      <w:r>
-        <w:lastRenderedPageBreak/>
-        <w:t>including the negotiations, any practices which the parties have established between themselves, usages and any subsequent conduct of the parties.</w:t>
-      </w:r>
       <w:commentRangeEnd w:id="4"/>
       <w:r>
         <w:rPr>
@@ -358,131 +291,227 @@
         </w:rPr>
         <w:commentReference w:id="4"/>
       </w:r>
-    </w:p>
-    <w:p>
-      <w:pPr>
-        <w:pStyle w:val="Heading2"/>
-      </w:pPr>
-      <w:r>
-        <w:t>Article 9</w:t>
-      </w:r>
-    </w:p>
-    <w:p>
-      <w:pPr>
-        <w:spacing w:after="120"/>
-      </w:pPr>
-      <w:r>
-        <w:t>(1)  The parties are bound by any usage to which they have agreed and by any practices which they have established between themselves.</w:t>
-      </w:r>
-    </w:p>
-    <w:p>
-      <w:pPr>
-        <w:spacing w:after="120"/>
-      </w:pPr>
-      <w:r>
-        <w:t>(2)  The parties are considered, unless otherwise agreed, to have impliedly made applicable to their contract or its formation a usage of which the parties knew or ought to have known and which in international trade is widely known to, and regularly observed by, parties to contracts of the type involved in the particular trade concerned.</w:t>
-      </w:r>
-    </w:p>
-    <w:p>
-      <w:pPr>
-        <w:pStyle w:val="Heading2"/>
-      </w:pPr>
-      <w:r>
-        <w:t>Article 10</w:t>
-      </w:r>
-    </w:p>
-    <w:p>
-      <w:pPr>
-        <w:spacing w:after="120"/>
-      </w:pPr>
-      <w:r>
-        <w:t>For the purposes of this Convention:</w:t>
-      </w:r>
-    </w:p>
-    <w:p>
-      <w:pPr>
-        <w:spacing w:after="120"/>
-        <w:ind w:left="432"/>
-      </w:pPr>
-      <w:r>
-        <w:t>(a)  if a party has more than one place of business, the place of business is that which has the closest relationship to the contract and its performance, having regard to the circumstances known to or contemplated by the parties at any time before or at the conclusion of the contract;</w:t>
-      </w:r>
-    </w:p>
-    <w:p>
-      <w:pPr>
-        <w:spacing w:after="120"/>
-        <w:ind w:left="432"/>
-      </w:pPr>
-      <w:r>
-        <w:t>(b)  if a party does not have a place of business, reference is to be made to his habitual residence.</w:t>
-      </w:r>
-    </w:p>
-    <w:p>
-      <w:pPr>
-        <w:pStyle w:val="Heading2"/>
-      </w:pPr>
-      <w:r>
-        <w:t>Article 11</w:t>
-      </w:r>
-    </w:p>
-    <w:p>
-      <w:pPr>
-        <w:spacing w:after="120"/>
-      </w:pPr>
-      <w:r>
-        <w:t>A contract of sale need not be concluded in or evidenced by writing and is not subject to any other requirement as to form. It may be proved by any means, including witnesses.</w:t>
-      </w:r>
-    </w:p>
-    <w:p>
-      <w:pPr>
-        <w:pStyle w:val="Heading2"/>
-      </w:pPr>
-      <w:r>
-        <w:t>Article 12</w:t>
-      </w:r>
-    </w:p>
-    <w:p>
-      <w:pPr>
-        <w:spacing w:after="120"/>
-      </w:pPr>
-      <w:r>
-        <w:t>Any provision of</w:t>
-      </w:r>
-      <w:r>
-        <w:t xml:space="preserve"> article 11, article 29 </w:t>
-      </w:r>
-      <w:r>
-        <w:t>or Part II of this Convention that allows a contract of sale or its modification or termination by agreement or any offer, acceptance or other indication of intention to be made in any form other than in writing does not apply where any party has his place of business in a Contracting State which has made a declaration under</w:t>
-      </w:r>
-      <w:r>
-        <w:t xml:space="preserve"> article 96 </w:t>
-      </w:r>
-      <w:r>
-        <w:t>of this Convention. The parties may not derogate from or vary the effect of this article.</w:t>
-      </w:r>
-    </w:p>
-    <w:p>
-      <w:pPr>
-        <w:pStyle w:val="Heading2"/>
-      </w:pPr>
-      <w:commentRangeStart w:id="5"/>
-      <w:r>
-        <w:t>Article 13</w:t>
-      </w:r>
-    </w:p>
-    <w:p>
-      <w:pPr>
-        <w:spacing w:after="120"/>
-      </w:pPr>
-      <w:r>
-        <w:t>For the purposes of this Convention "writing" includes telegram and telex.</w:t>
-      </w:r>
       <w:commentRangeEnd w:id="5"/>
       <w:r>
         <w:rPr>
           <w:rStyle w:val="CommentReference"/>
         </w:rPr>
         <w:commentReference w:id="5"/>
+      </w:r>
+    </w:p>
+    <w:p>
+      <w:pPr>
+        <w:pStyle w:val="Heading2"/>
+      </w:pPr>
+      <w:r>
+        <w:t>CHAPTER II. GENERAL PROVISIONS</w:t>
+      </w:r>
+    </w:p>
+    <w:p>
+      <w:pPr>
+        <w:pStyle w:val="Heading2"/>
+      </w:pPr>
+      <w:r>
+        <w:t>Article 7</w:t>
+      </w:r>
+    </w:p>
+    <w:p>
+      <w:pPr>
+        <w:spacing w:after="120"/>
+      </w:pPr>
+      <w:r>
+        <w:t>(1)  In the interpretation of this Convention, regard is to be had to its international character and to the need to promote uniformity in its application and the observance of good faith in international trade.</w:t>
+      </w:r>
+    </w:p>
+    <w:p>
+      <w:pPr>
+        <w:spacing w:after="120"/>
+      </w:pPr>
+      <w:r>
+        <w:t>(2)  Questions concerning matters governed by this Convention which are not expressly settled in it are to be settled in conformity with the general principles on which it is based or, in the absence of such principles, in conformity with the law applicable by virtue of the rules of private international law.</w:t>
+      </w:r>
+    </w:p>
+    <w:p>
+      <w:pPr>
+        <w:pStyle w:val="Heading2"/>
+      </w:pPr>
+      <w:commentRangeStart w:id="6"/>
+      <w:r>
+        <w:t>Article 8</w:t>
+      </w:r>
+    </w:p>
+    <w:p>
+      <w:pPr>
+        <w:spacing w:after="120"/>
+      </w:pPr>
+      <w:r>
+        <w:t>(1)  For the purposes of this Convention statements made by and other conduct of a party are to be interpreted according to his intent where the other party knew or could not have been unaware what that intent was.</w:t>
+      </w:r>
+    </w:p>
+    <w:p>
+      <w:pPr>
+        <w:spacing w:after="120"/>
+      </w:pPr>
+      <w:r>
+        <w:t>(2)  If the preceding paragraph is not applicable, statements made by and other conduct of a party are to be interpreted according to the understanding that a reasonable person of the same kind as the other party would have had in the same circumstances.</w:t>
+      </w:r>
+    </w:p>
+    <w:p>
+      <w:pPr>
+        <w:spacing w:after="120"/>
+      </w:pPr>
+      <w:r>
+        <w:t xml:space="preserve">(3)  In determining the intent of a party or the understanding a reasonable person would have had, due consideration is to be given to all relevant circumstances of the case </w:t>
+      </w:r>
+      <w:r>
+        <w:lastRenderedPageBreak/>
+        <w:t>including the negotiations, any practices which the parties have established between themselves, usages and any subsequent conduct of the parties.</w:t>
+      </w:r>
+      <w:commentRangeEnd w:id="6"/>
+      <w:r>
+        <w:rPr>
+          <w:rStyle w:val="CommentReference"/>
+        </w:rPr>
+        <w:commentReference w:id="6"/>
+      </w:r>
+    </w:p>
+    <w:p>
+      <w:pPr>
+        <w:pStyle w:val="Heading2"/>
+      </w:pPr>
+      <w:r>
+        <w:t>Article 9</w:t>
+      </w:r>
+    </w:p>
+    <w:p>
+      <w:pPr>
+        <w:spacing w:after="120"/>
+      </w:pPr>
+      <w:r>
+        <w:t>(1)  The parties are bound by any usage to which they have agreed and by any practices which they have established between themselves.</w:t>
+      </w:r>
+    </w:p>
+    <w:p>
+      <w:pPr>
+        <w:spacing w:after="120"/>
+      </w:pPr>
+      <w:r>
+        <w:t>(2)  The parties are considered, unless otherwise agreed, to have impliedly made applicable to their contract or its formation a usage of which the parties knew or ought to have known and which in international trade is widely known to, and regularly observed by, parties to contracts of the type involved in the particular trade concerned.</w:t>
+      </w:r>
+    </w:p>
+    <w:p>
+      <w:pPr>
+        <w:pStyle w:val="Heading2"/>
+      </w:pPr>
+      <w:r>
+        <w:t>Article 10</w:t>
+      </w:r>
+    </w:p>
+    <w:p>
+      <w:pPr>
+        <w:spacing w:after="120"/>
+      </w:pPr>
+      <w:r>
+        <w:t>For the purposes of this Convention:</w:t>
+      </w:r>
+    </w:p>
+    <w:p>
+      <w:pPr>
+        <w:spacing w:after="120"/>
+        <w:ind w:left="432"/>
+      </w:pPr>
+      <w:commentRangeStart w:id="7"/>
+      <w:r>
+        <w:t xml:space="preserve">(a)  if a party has more than one place of business, the place of business is that which has the closest relationship to the contract and its performance, having regard to the circumstances known to or contemplated by the parties at any time before or at the conclusion of the </w:t>
+      </w:r>
+      <w:proofErr w:type="gramStart"/>
+      <w:r>
+        <w:t>contract;</w:t>
+      </w:r>
+      <w:commentRangeEnd w:id="7"/>
+      <w:proofErr w:type="gramEnd"/>
+      <w:r>
+        <w:rPr>
+          <w:rStyle w:val="CommentReference"/>
+        </w:rPr>
+        <w:commentReference w:id="7"/>
+      </w:r>
+    </w:p>
+    <w:p>
+      <w:pPr>
+        <w:spacing w:after="120"/>
+        <w:ind w:left="432"/>
+      </w:pPr>
+      <w:r>
+        <w:t>(b)  if a party does not have a place of business, reference is to be made to his habitual residence.</w:t>
+      </w:r>
+    </w:p>
+    <w:p>
+      <w:pPr>
+        <w:pStyle w:val="Heading2"/>
+      </w:pPr>
+      <w:r>
+        <w:t>Article 11</w:t>
+      </w:r>
+    </w:p>
+    <w:p>
+      <w:pPr>
+        <w:spacing w:after="120"/>
+      </w:pPr>
+      <w:r>
+        <w:t>A contract of sale need not be concluded in or evidenced by writing and is not subject to any other requirement as to form. It may be proved by any means, including witnesses.</w:t>
+      </w:r>
+    </w:p>
+    <w:p>
+      <w:pPr>
+        <w:pStyle w:val="Heading2"/>
+      </w:pPr>
+      <w:r>
+        <w:t>Article 12</w:t>
+      </w:r>
+    </w:p>
+    <w:p>
+      <w:pPr>
+        <w:spacing w:after="120"/>
+      </w:pPr>
+      <w:r>
+        <w:t>Any provision of</w:t>
+      </w:r>
+      <w:r>
+        <w:t xml:space="preserve"> article 11, article 29 </w:t>
+      </w:r>
+      <w:r>
+        <w:t>or Part II of this Convention that allows a contract of sale or its modification or termination by agreement or any offer, acceptance or other indication of intention to be made in any form other than in writing does not apply where any party has his place of business in a Contracting State which has made a declaration under</w:t>
+      </w:r>
+      <w:r>
+        <w:t xml:space="preserve"> article 96 </w:t>
+      </w:r>
+      <w:r>
+        <w:t>of this Convention. The parties may not derogate from or vary the effect of this article.</w:t>
+      </w:r>
+    </w:p>
+    <w:p>
+      <w:pPr>
+        <w:pStyle w:val="Heading2"/>
+      </w:pPr>
+      <w:commentRangeStart w:id="8"/>
+      <w:r>
+        <w:t>Article 13</w:t>
+      </w:r>
+    </w:p>
+    <w:p>
+      <w:pPr>
+        <w:spacing w:after="120"/>
+      </w:pPr>
+      <w:r>
+        <w:t>For the purposes of this Convention "writing" includes telegram and telex.</w:t>
+      </w:r>
+      <w:commentRangeEnd w:id="8"/>
+      <w:r>
+        <w:rPr>
+          <w:rStyle w:val="CommentReference"/>
+        </w:rPr>
+        <w:commentReference w:id="8"/>
       </w:r>
     </w:p>
     <w:p>
@@ -1086,8 +1115,8 @@
       <w:pPr>
         <w:pStyle w:val="Heading2"/>
       </w:pPr>
-      <w:commentRangeStart w:id="6"/>
-      <w:commentRangeStart w:id="7"/>
+      <w:commentRangeStart w:id="9"/>
+      <w:commentRangeStart w:id="10"/>
       <w:r>
         <w:t>Article 35</w:t>
       </w:r>
@@ -1171,19 +1200,19 @@
       <w:r>
         <w:t xml:space="preserve"> the preceding paragraph for any lack of conformity of the goods if at the time of the conclusion of the contract the buyer knew or could not have been unaware of such lack of conformity.</w:t>
       </w:r>
-      <w:commentRangeEnd w:id="6"/>
+      <w:commentRangeEnd w:id="9"/>
       <w:r>
         <w:rPr>
           <w:rStyle w:val="CommentReference"/>
         </w:rPr>
-        <w:commentReference w:id="6"/>
-      </w:r>
-      <w:commentRangeEnd w:id="7"/>
+        <w:commentReference w:id="9"/>
+      </w:r>
+      <w:commentRangeEnd w:id="10"/>
       <w:r>
         <w:rPr>
           <w:rStyle w:val="CommentReference"/>
         </w:rPr>
-        <w:commentReference w:id="7"/>
+        <w:commentReference w:id="10"/>
       </w:r>
     </w:p>
     <w:p>
@@ -1231,7 +1260,7 @@
       <w:pPr>
         <w:pStyle w:val="Heading2"/>
       </w:pPr>
-      <w:commentRangeStart w:id="8"/>
+      <w:commentRangeStart w:id="11"/>
       <w:r>
         <w:t>Article 38</w:t>
       </w:r>
@@ -1283,12 +1312,12 @@
       <w:r>
         <w:t>(2)  In any event, the buyer loses the right to rely on a lack of conformity of the goods if he does not give the seller notice thereof at the latest within a period of two years from the date on which the goods were actually handed over to the buyer, unless this time-limit is inconsistent with a contractual period of guarantee.</w:t>
       </w:r>
-      <w:commentRangeEnd w:id="8"/>
+      <w:commentRangeEnd w:id="11"/>
       <w:r>
         <w:rPr>
           <w:rStyle w:val="CommentReference"/>
         </w:rPr>
-        <w:commentReference w:id="8"/>
+        <w:commentReference w:id="11"/>
       </w:r>
     </w:p>
     <w:p>
@@ -1331,6 +1360,7 @@
       <w:pPr>
         <w:pStyle w:val="Heading2"/>
       </w:pPr>
+      <w:commentRangeStart w:id="12"/>
       <w:r>
         <w:t>Article 42</w:t>
       </w:r>
@@ -1376,6 +1406,13 @@
       </w:pPr>
       <w:r>
         <w:t>(a)  at the time of the conclusion of the contract the buyer knew or could not have been unaware of the right or claim; or(b) the right or claim results from the seller's compliance with technical drawings, designs, formulae or other such specifications furnished by the buyer.</w:t>
+      </w:r>
+      <w:commentRangeEnd w:id="12"/>
+      <w:r>
+        <w:rPr>
+          <w:rStyle w:val="CommentReference"/>
+        </w:rPr>
+        <w:commentReference w:id="12"/>
       </w:r>
     </w:p>
     <w:p>
@@ -1552,6 +1589,7 @@
       <w:pPr>
         <w:spacing w:after="120"/>
       </w:pPr>
+      <w:commentRangeStart w:id="13"/>
       <w:r>
         <w:t>(2)  If the goods do not conform with the contract, the buyer may require delivery of substitute goods only if the lack of conformity constitutes a fundamental breach of contract and a request for substitute goods is made either in conjunction with notice given under</w:t>
       </w:r>
@@ -1575,124 +1613,115 @@
       <w:r>
         <w:t>or within a reasonable time thereafter.</w:t>
       </w:r>
-    </w:p>
-    <w:p>
-      <w:pPr>
-        <w:pStyle w:val="Heading2"/>
-      </w:pPr>
-      <w:r>
-        <w:t>Article 47</w:t>
-      </w:r>
-    </w:p>
-    <w:p>
-      <w:pPr>
-        <w:spacing w:after="120"/>
-      </w:pPr>
-      <w:r>
-        <w:t>(1)  The buyer may fix an additional period of time of reasonable length for performance by the seller of his obligations.</w:t>
-      </w:r>
-    </w:p>
-    <w:p>
-      <w:pPr>
-        <w:spacing w:after="120"/>
-      </w:pPr>
-      <w:r>
-        <w:t>(2)  Unless the buyer has received notice from the seller that he will not perform within the period so fixed, the buyer may not, during that period, resort to any remedy for breach of contract. However, the buyer is not deprived thereby of any right he may have to claim damages for delay in performance.</w:t>
-      </w:r>
-    </w:p>
-    <w:p>
-      <w:pPr>
-        <w:pStyle w:val="Heading2"/>
-      </w:pPr>
-      <w:r>
-        <w:t>Article 48</w:t>
-      </w:r>
-    </w:p>
-    <w:p>
-      <w:pPr>
-        <w:spacing w:after="120"/>
-      </w:pPr>
-      <w:r>
-        <w:t>(1)  Subject to</w:t>
-      </w:r>
-      <w:r>
-        <w:t xml:space="preserve"> article 49</w:t>
-      </w:r>
-      <w:r>
-        <w:t xml:space="preserve">, the seller may, even after the date for delivery, remedy at his own expense any failure to perform his obligations, if he can do so without unreasonable delay and without causing the buyer unreasonable inconvenience or uncertainty of </w:t>
-      </w:r>
-      <w:r>
-        <w:lastRenderedPageBreak/>
-        <w:t>reimbursement by the seller of expenses advanced by the buyer. However, the buyer retains any right to claim damages as provided for in this Convention.</w:t>
-      </w:r>
-    </w:p>
-    <w:p>
-      <w:pPr>
-        <w:spacing w:after="120"/>
-      </w:pPr>
-      <w:r>
-        <w:t>(2)  If the seller requests the buyer to make known whether he will accept performance and the buyer does not comply with the request within a reasonable time, the seller may perform within the time indicated in his request. The buyer may not, during that period of time, resort to any remedy which is inconsistent with performance by the seller.</w:t>
-      </w:r>
-    </w:p>
-    <w:p>
-      <w:pPr>
-        <w:spacing w:after="120"/>
-      </w:pPr>
-      <w:r>
-        <w:t>(3)  A notice by the seller that he will perform within a specified period of time is assumed to include a request, under the preceding paragraph, that the buyer make known his decision.</w:t>
-      </w:r>
-    </w:p>
-    <w:p>
-      <w:pPr>
-        <w:spacing w:after="120"/>
-      </w:pPr>
-      <w:r>
-        <w:t>(4)  A request or notice by the seller under paragraph</w:t>
-      </w:r>
-      <w:r>
-        <w:t xml:space="preserve"> </w:t>
-      </w:r>
-      <w:r>
-        <w:t>(2) or</w:t>
-      </w:r>
-      <w:r>
-        <w:t xml:space="preserve"> </w:t>
-      </w:r>
-      <w:r>
-        <w:t>(3) of this article is not effective unless received by the buyer.</w:t>
-      </w:r>
-    </w:p>
-    <w:p>
-      <w:pPr>
-        <w:pStyle w:val="Heading2"/>
-      </w:pPr>
-      <w:r>
-        <w:t>Article 49</w:t>
-      </w:r>
-    </w:p>
-    <w:p>
-      <w:pPr>
-        <w:spacing w:after="120"/>
-      </w:pPr>
-      <w:r>
-        <w:t>(1)  The buyer may declare the contract avoided:</w:t>
-      </w:r>
-    </w:p>
-    <w:p>
-      <w:pPr>
-        <w:spacing w:after="120"/>
-        <w:ind w:left="432"/>
-      </w:pPr>
-      <w:commentRangeStart w:id="9"/>
-      <w:r>
-        <w:t>(a)  if the failure by the seller to perform any of his obligations under the contract or this Convention amounts to a fundamental breach of contract; or</w:t>
-      </w:r>
-      <w:commentRangeEnd w:id="9"/>
+      <w:commentRangeEnd w:id="13"/>
       <w:r>
         <w:rPr>
           <w:rStyle w:val="CommentReference"/>
         </w:rPr>
-        <w:commentReference w:id="9"/>
+        <w:commentReference w:id="13"/>
+      </w:r>
+    </w:p>
+    <w:p>
+      <w:pPr>
+        <w:pStyle w:val="Heading2"/>
+      </w:pPr>
+      <w:r>
+        <w:t>Article 47</w:t>
+      </w:r>
+    </w:p>
+    <w:p>
+      <w:pPr>
+        <w:spacing w:after="120"/>
+      </w:pPr>
+      <w:r>
+        <w:t>(1)  The buyer may fix an additional period of time of reasonable length for performance by the seller of his obligations.</w:t>
+      </w:r>
+    </w:p>
+    <w:p>
+      <w:pPr>
+        <w:spacing w:after="120"/>
+      </w:pPr>
+      <w:r>
+        <w:t>(2)  Unless the buyer has received notice from the seller that he will not perform within the period so fixed, the buyer may not, during that period, resort to any remedy for breach of contract. However, the buyer is not deprived thereby of any right he may have to claim damages for delay in performance.</w:t>
+      </w:r>
+    </w:p>
+    <w:p>
+      <w:pPr>
+        <w:pStyle w:val="Heading2"/>
+      </w:pPr>
+      <w:r>
+        <w:t>Article 48</w:t>
+      </w:r>
+    </w:p>
+    <w:p>
+      <w:pPr>
+        <w:spacing w:after="120"/>
+      </w:pPr>
+      <w:r>
+        <w:t>(1)  Subject to</w:t>
+      </w:r>
+      <w:r>
+        <w:t xml:space="preserve"> article 49</w:t>
+      </w:r>
+      <w:r>
+        <w:t xml:space="preserve">, the seller may, even after the date for delivery, remedy at his own expense any failure to perform his obligations, if he can do so without unreasonable delay and without causing the buyer unreasonable inconvenience or uncertainty of </w:t>
+      </w:r>
+      <w:r>
+        <w:lastRenderedPageBreak/>
+        <w:t>reimbursement by the seller of expenses advanced by the buyer. However, the buyer retains any right to claim damages as provided for in this Convention.</w:t>
+      </w:r>
+    </w:p>
+    <w:p>
+      <w:pPr>
+        <w:spacing w:after="120"/>
+      </w:pPr>
+      <w:r>
+        <w:t>(2)  If the seller requests the buyer to make known whether he will accept performance and the buyer does not comply with the request within a reasonable time, the seller may perform within the time indicated in his request. The buyer may not, during that period of time, resort to any remedy which is inconsistent with performance by the seller.</w:t>
+      </w:r>
+    </w:p>
+    <w:p>
+      <w:pPr>
+        <w:spacing w:after="120"/>
+      </w:pPr>
+      <w:r>
+        <w:t>(3)  A notice by the seller that he will perform within a specified period of time is assumed to include a request, under the preceding paragraph, that the buyer make known his decision.</w:t>
+      </w:r>
+    </w:p>
+    <w:p>
+      <w:pPr>
+        <w:spacing w:after="120"/>
+      </w:pPr>
+      <w:r>
+        <w:t>(4)  A request or notice by the seller under paragraph</w:t>
+      </w:r>
+      <w:r>
+        <w:t xml:space="preserve"> </w:t>
+      </w:r>
+      <w:r>
+        <w:t>(2) or</w:t>
+      </w:r>
+      <w:r>
+        <w:t xml:space="preserve"> </w:t>
+      </w:r>
+      <w:r>
+        <w:t>(3) of this article is not effective unless received by the buyer.</w:t>
+      </w:r>
+    </w:p>
+    <w:p>
+      <w:pPr>
+        <w:pStyle w:val="Heading2"/>
+      </w:pPr>
+      <w:commentRangeStart w:id="14"/>
+      <w:r>
+        <w:t>Article 49</w:t>
+      </w:r>
+    </w:p>
+    <w:p>
+      <w:pPr>
+        <w:spacing w:after="120"/>
+      </w:pPr>
+      <w:r>
+        <w:t>(1)  The buyer may declare the contract avoided:</w:t>
       </w:r>
     </w:p>
     <w:p>
@@ -1700,6 +1729,23 @@
         <w:spacing w:after="120"/>
         <w:ind w:left="432"/>
       </w:pPr>
+      <w:commentRangeStart w:id="15"/>
+      <w:r>
+        <w:t>(a)  if the failure by the seller to perform any of his obligations under the contract or this Convention amounts to a fundamental breach of contract; or</w:t>
+      </w:r>
+      <w:commentRangeEnd w:id="15"/>
+      <w:r>
+        <w:rPr>
+          <w:rStyle w:val="CommentReference"/>
+        </w:rPr>
+        <w:commentReference w:id="15"/>
+      </w:r>
+    </w:p>
+    <w:p>
+      <w:pPr>
+        <w:spacing w:after="120"/>
+        <w:ind w:left="432"/>
+      </w:pPr>
       <w:r>
         <w:t xml:space="preserve">(b)  in case of non-delivery, if the seller does not deliver the goods within the additional </w:t>
       </w:r>
@@ -1790,6 +1836,13 @@
       </w:r>
       <w:r>
         <w:t>, or after the buyer has declared that he will not accept performances.</w:t>
+      </w:r>
+      <w:commentRangeEnd w:id="14"/>
+      <w:r>
+        <w:rPr>
+          <w:rStyle w:val="CommentReference"/>
+        </w:rPr>
+        <w:commentReference w:id="14"/>
       </w:r>
     </w:p>
     <w:p>
@@ -2015,6 +2068,7 @@
       <w:pPr>
         <w:pStyle w:val="Heading2"/>
       </w:pPr>
+      <w:commentRangeStart w:id="16"/>
       <w:r>
         <w:t>Article 58</w:t>
       </w:r>
@@ -2041,6 +2095,13 @@
       </w:pPr>
       <w:r>
         <w:t>(3)  The buyer is not bound to pay the price until he has had an opportunity to examine the goods, unless the procedures for delivery or payment agreed upon by the parties are inconsistent with his having such an opportunity.</w:t>
+      </w:r>
+      <w:commentRangeEnd w:id="16"/>
+      <w:r>
+        <w:rPr>
+          <w:rStyle w:val="CommentReference"/>
+        </w:rPr>
+        <w:commentReference w:id="16"/>
       </w:r>
     </w:p>
     <w:p>
@@ -2254,6 +2315,7 @@
       <w:pPr>
         <w:pStyle w:val="Heading2"/>
       </w:pPr>
+      <w:commentRangeStart w:id="17"/>
       <w:r>
         <w:t>Article 64</w:t>
       </w:r>
@@ -2363,6 +2425,13 @@
       </w:r>
       <w:r>
         <w:t>, or after the buyer has declared that he will not perform his obligations within such an additional period.</w:t>
+      </w:r>
+      <w:commentRangeEnd w:id="17"/>
+      <w:r>
+        <w:rPr>
+          <w:rStyle w:val="CommentReference"/>
+        </w:rPr>
+        <w:commentReference w:id="17"/>
       </w:r>
     </w:p>
     <w:p>
@@ -2677,7 +2746,7 @@
       <w:pPr>
         <w:pStyle w:val="Heading2"/>
       </w:pPr>
-      <w:commentRangeStart w:id="10"/>
+      <w:commentRangeStart w:id="18"/>
       <w:r>
         <w:t>Article 74</w:t>
       </w:r>
@@ -2689,18 +2758,19 @@
       <w:r>
         <w:t>Damages for breach of contract by one party consist of a sum equal to the loss, including loss of profit, suffered by the other party as a consequence of the breach. Such damages may not exceed the loss which the party in breach foresaw or ought to have foreseen at the time of the conclusion of the contract, in the light of the facts and matters of which he then knew or ought to have known, as a possible consequence of the breach of contract.</w:t>
       </w:r>
-      <w:commentRangeEnd w:id="10"/>
+      <w:commentRangeEnd w:id="18"/>
       <w:r>
         <w:rPr>
           <w:rStyle w:val="CommentReference"/>
         </w:rPr>
-        <w:commentReference w:id="10"/>
+        <w:commentReference w:id="18"/>
       </w:r>
     </w:p>
     <w:p>
       <w:pPr>
         <w:pStyle w:val="Heading2"/>
       </w:pPr>
+      <w:commentRangeStart w:id="19"/>
       <w:r>
         <w:t>Article 75</w:t>
       </w:r>
@@ -2754,6 +2824,13 @@
       </w:pPr>
       <w:r>
         <w:t>(2)  For the purposes of the preceding paragraph, the current price is the price prevailing at the place where delivery of the goods should have been made or, if there is no current price at that place, the price at such other place as serves as a reasonable substitute, making due allowance for differences in the cost of transporting the goods.</w:t>
+      </w:r>
+      <w:commentRangeEnd w:id="19"/>
+      <w:r>
+        <w:rPr>
+          <w:rStyle w:val="CommentReference"/>
+        </w:rPr>
+        <w:commentReference w:id="19"/>
       </w:r>
     </w:p>
     <w:p>
@@ -2805,6 +2882,7 @@
       <w:pPr>
         <w:pStyle w:val="Heading2"/>
       </w:pPr>
+      <w:commentRangeStart w:id="20"/>
       <w:r>
         <w:t>Article 78</w:t>
       </w:r>
@@ -2821,6 +2899,13 @@
       </w:r>
       <w:r>
         <w:t xml:space="preserve">. </w:t>
+      </w:r>
+      <w:commentRangeEnd w:id="20"/>
+      <w:r>
+        <w:rPr>
+          <w:rStyle w:val="CommentReference"/>
+        </w:rPr>
+        <w:commentReference w:id="20"/>
       </w:r>
     </w:p>
     <w:p>
@@ -2856,6 +2941,7 @@
       <w:pPr>
         <w:pStyle w:val="Heading2"/>
       </w:pPr>
+      <w:commentRangeStart w:id="21"/>
       <w:r>
         <w:t>Article 79</w:t>
       </w:r>
@@ -2917,6 +3003,13 @@
       </w:pPr>
       <w:r>
         <w:t>(5)  Nothing in this article prevents either party from exercising any right other than to claim damages under this Convention.</w:t>
+      </w:r>
+      <w:commentRangeEnd w:id="21"/>
+      <w:r>
+        <w:rPr>
+          <w:rStyle w:val="CommentReference"/>
+        </w:rPr>
+        <w:commentReference w:id="21"/>
       </w:r>
     </w:p>
     <w:p>
@@ -2984,8 +3077,16 @@
       <w:pPr>
         <w:spacing w:after="120"/>
       </w:pPr>
+      <w:commentRangeStart w:id="22"/>
       <w:r>
         <w:t>(2)  A party who has performed the contract either wholly or in part may claim restitution from the other party of whatever the first party has supplied or paid under the contract. If both parties are bound to make restitution, they must do so concurrently.</w:t>
+      </w:r>
+      <w:commentRangeEnd w:id="22"/>
+      <w:r>
+        <w:rPr>
+          <w:rStyle w:val="CommentReference"/>
+        </w:rPr>
+        <w:commentReference w:id="22"/>
       </w:r>
     </w:p>
     <w:p>
@@ -3466,6 +3567,7 @@
       <w:pPr>
         <w:pStyle w:val="Heading2"/>
       </w:pPr>
+      <w:commentRangeStart w:id="23"/>
       <w:r>
         <w:t>Article 95</w:t>
       </w:r>
@@ -3531,6 +3633,13 @@
       </w:r>
       <w:r>
         <w:t>, or Part II of this Convention, that allows a contract of sale or its modification or termination by agreement or any offer, acceptance, or other indication of intention to be made in any form other than in writing, does not apply where any party has his place of business in that State.</w:t>
+      </w:r>
+      <w:commentRangeEnd w:id="23"/>
+      <w:r>
+        <w:rPr>
+          <w:rStyle w:val="CommentReference"/>
+        </w:rPr>
+        <w:commentReference w:id="23"/>
       </w:r>
     </w:p>
     <w:p>
@@ -3861,7 +3970,7 @@
           <w:sz w:val="20"/>
           <w:szCs w:val="20"/>
         </w:rPr>
-        <w:t xml:space="preserve">See CISG Advisory Council Opinion No 4 for a comprehensive analysis of this provision: </w:t>
+        <w:t xml:space="preserve">See CISG Advisory Council Opinion No 4 for analysis of this provision: </w:t>
       </w:r>
       <w:hyperlink r:id="rId2" w:history="1">
         <w:r>
@@ -3882,7 +3991,7 @@
       </w:r>
     </w:p>
   </w:comment>
-  <w:comment w:id="2" w:author="Oscar Pearce" w:date="2025-10-05T15:42:00Z" w:initials="OP">
+  <w:comment w:id="2" w:author="Oscar Pearce" w:date="2025-10-05T16:28:00Z" w:initials="OP">
     <w:p>
       <w:r>
         <w:rPr>
@@ -3895,9 +4004,43 @@
           <w:sz w:val="20"/>
           <w:szCs w:val="20"/>
         </w:rPr>
-        <w:t xml:space="preserve">See CISG Advisory Council Opinion No 16 for a comprehensive analysis of this provision: </w:t>
+        <w:t xml:space="preserve">For a discussion of the liabilities that are and are not excluded by this provision, see CISG Advisory Council Opinion No 12: </w:t>
       </w:r>
       <w:hyperlink r:id="rId3" w:history="1">
+        <w:r>
+          <w:rPr>
+            <w:rStyle w:val="Hyperlink"/>
+            <w:sz w:val="20"/>
+            <w:szCs w:val="20"/>
+          </w:rPr>
+          <w:t>https://cisgac.com/opinions/cisgac-opinion-no-12/</w:t>
+        </w:r>
+      </w:hyperlink>
+      <w:r>
+        <w:rPr>
+          <w:sz w:val="20"/>
+          <w:szCs w:val="20"/>
+        </w:rPr>
+        <w:t>.</w:t>
+      </w:r>
+    </w:p>
+  </w:comment>
+  <w:comment w:id="3" w:author="Oscar Pearce" w:date="2025-10-05T15:42:00Z" w:initials="OP">
+    <w:p>
+      <w:r>
+        <w:rPr>
+          <w:rStyle w:val="CommentReference"/>
+        </w:rPr>
+        <w:annotationRef/>
+      </w:r>
+      <w:r>
+        <w:rPr>
+          <w:sz w:val="20"/>
+          <w:szCs w:val="20"/>
+        </w:rPr>
+        <w:t xml:space="preserve">See CISG Advisory Council Opinion No 16 for analysis of this provision: </w:t>
+      </w:r>
+      <w:hyperlink r:id="rId4" w:history="1">
         <w:r>
           <w:rPr>
             <w:rStyle w:val="Hyperlink"/>
@@ -3916,7 +4059,7 @@
       </w:r>
     </w:p>
   </w:comment>
-  <w:comment w:id="3" w:author="Oscar Pearce" w:date="2025-10-05T15:42:00Z" w:initials="OP">
+  <w:comment w:id="4" w:author="Oscar Pearce" w:date="2025-10-05T15:42:00Z" w:initials="OP">
     <w:p>
       <w:r>
         <w:rPr>
@@ -3930,40 +4073,6 @@
           <w:szCs w:val="20"/>
         </w:rPr>
         <w:t xml:space="preserve">See also CISG Advisory Council Opinion No 3 for the application of this provision to merger clauses: </w:t>
-      </w:r>
-      <w:hyperlink r:id="rId4" w:history="1">
-        <w:r>
-          <w:rPr>
-            <w:rStyle w:val="Hyperlink"/>
-            <w:sz w:val="20"/>
-            <w:szCs w:val="20"/>
-          </w:rPr>
-          <w:t>https://cisgac.com/opinions/cisgac-opinion-no-3/</w:t>
-        </w:r>
-      </w:hyperlink>
-      <w:r>
-        <w:rPr>
-          <w:sz w:val="20"/>
-          <w:szCs w:val="20"/>
-        </w:rPr>
-        <w:t>. In short, 'specific wording' is needed to derogate from the general interpretation rules in Article 8.</w:t>
-      </w:r>
-    </w:p>
-  </w:comment>
-  <w:comment w:id="4" w:author="Oscar Pearce" w:date="2025-10-05T15:47:00Z" w:initials="OP">
-    <w:p>
-      <w:r>
-        <w:rPr>
-          <w:rStyle w:val="CommentReference"/>
-        </w:rPr>
-        <w:annotationRef/>
-      </w:r>
-      <w:r>
-        <w:rPr>
-          <w:sz w:val="20"/>
-          <w:szCs w:val="20"/>
-        </w:rPr>
-        <w:t xml:space="preserve">Note that the CISG has this bespoke interpretation regime, and does not incorporate the Parol Evidence Rule. On the latter, see CISG Advisory Council Opinion No 3: </w:t>
       </w:r>
       <w:hyperlink r:id="rId5" w:history="1">
         <w:r>
@@ -3980,11 +4089,146 @@
           <w:sz w:val="20"/>
           <w:szCs w:val="20"/>
         </w:rPr>
+        <w:t>. In short, 'specific wording' is needed to derogate from the general interpretation rules in Article 8.</w:t>
+      </w:r>
+    </w:p>
+  </w:comment>
+  <w:comment w:id="5" w:author="Oscar Pearce" w:date="2025-10-05T16:34:00Z" w:initials="OP">
+    <w:p>
+      <w:r>
+        <w:rPr>
+          <w:rStyle w:val="CommentReference"/>
+        </w:rPr>
+        <w:annotationRef/>
+      </w:r>
+      <w:r>
+        <w:rPr>
+          <w:sz w:val="20"/>
+          <w:szCs w:val="20"/>
+        </w:rPr>
+        <w:t xml:space="preserve">See also CISG Advisory Council Opinion No 17 for the application of this provision to limitation and exclusion clauses: </w:t>
+      </w:r>
+      <w:hyperlink r:id="rId6" w:history="1">
+        <w:r>
+          <w:rPr>
+            <w:rStyle w:val="Hyperlink"/>
+            <w:sz w:val="20"/>
+            <w:szCs w:val="20"/>
+          </w:rPr>
+          <w:t>https://cisgac.com/opinions/cisgac-opinion-no-17/</w:t>
+        </w:r>
+      </w:hyperlink>
+      <w:r>
+        <w:rPr>
+          <w:sz w:val="20"/>
+          <w:szCs w:val="20"/>
+        </w:rPr>
         <w:t>.</w:t>
       </w:r>
     </w:p>
   </w:comment>
-  <w:comment w:id="5" w:author="Oscar Pearce" w:date="2025-10-05T15:49:00Z" w:initials="OP">
+  <w:comment w:id="6" w:author="Oscar Pearce" w:date="2025-10-05T15:47:00Z" w:initials="OP">
+    <w:p>
+      <w:r>
+        <w:rPr>
+          <w:rStyle w:val="CommentReference"/>
+        </w:rPr>
+        <w:annotationRef/>
+      </w:r>
+      <w:r>
+        <w:rPr>
+          <w:sz w:val="20"/>
+          <w:szCs w:val="20"/>
+        </w:rPr>
+        <w:t xml:space="preserve">Note that the CISG has this bespoke interpretation regime, and does not incorporate the Parol Evidence Rule. On the latter, see CISG Advisory Council Opinion No 3: </w:t>
+      </w:r>
+      <w:hyperlink r:id="rId7" w:history="1">
+        <w:r>
+          <w:rPr>
+            <w:rStyle w:val="Hyperlink"/>
+            <w:sz w:val="20"/>
+            <w:szCs w:val="20"/>
+          </w:rPr>
+          <w:t>https://cisgac.com/opinions/cisgac-opinion-no-3/</w:t>
+        </w:r>
+      </w:hyperlink>
+      <w:r>
+        <w:rPr>
+          <w:sz w:val="20"/>
+          <w:szCs w:val="20"/>
+        </w:rPr>
+        <w:t>.</w:t>
+      </w:r>
+    </w:p>
+  </w:comment>
+  <w:comment w:id="7" w:author="Oscar Pearce" w:date="2025-10-05T16:52:00Z" w:initials="OP">
+    <w:p>
+      <w:r>
+        <w:rPr>
+          <w:rStyle w:val="CommentReference"/>
+        </w:rPr>
+        <w:annotationRef/>
+      </w:r>
+      <w:r>
+        <w:rPr>
+          <w:sz w:val="20"/>
+          <w:szCs w:val="20"/>
+        </w:rPr>
+        <w:t xml:space="preserve">A place of business does not have to be the main administrative residence. Instead, it is "every location from which [a party] participates in economic transactions in a somehow independent manner”: </w:t>
+      </w:r>
+      <w:r>
+        <w:rPr>
+          <w:i/>
+          <w:iCs/>
+          <w:sz w:val="20"/>
+          <w:szCs w:val="20"/>
+        </w:rPr>
+        <w:t>Chinchilla Furs Case</w:t>
+      </w:r>
+      <w:r>
+        <w:rPr>
+          <w:sz w:val="20"/>
+          <w:szCs w:val="20"/>
+        </w:rPr>
+        <w:t xml:space="preserve">, </w:t>
+      </w:r>
+      <w:hyperlink r:id="rId8" w:history="1">
+        <w:r>
+          <w:rPr>
+            <w:rStyle w:val="Hyperlink"/>
+            <w:sz w:val="20"/>
+            <w:szCs w:val="20"/>
+          </w:rPr>
+          <w:t>https://cisg-online.org/search-for-cases?caseId=6096</w:t>
+        </w:r>
+      </w:hyperlink>
+      <w:r>
+        <w:rPr>
+          <w:sz w:val="20"/>
+          <w:szCs w:val="20"/>
+        </w:rPr>
+        <w:t xml:space="preserve">. This does, however, require "a permanent and stable business organisation and not the place where only preparations for the conclusion of a single contract have been made”: ICC Case 9781, see [5] </w:t>
+      </w:r>
+      <w:hyperlink r:id="rId9" w:history="1">
+        <w:r>
+          <w:rPr>
+            <w:rStyle w:val="Hyperlink"/>
+            <w:sz w:val="20"/>
+            <w:szCs w:val="20"/>
+          </w:rPr>
+          <w:t>https://cisg-online.org/media/06GPNHI0/2016_UNCITRAL_CISG_Digest_Article_1.pdf</w:t>
+        </w:r>
+      </w:hyperlink>
+      <w:r>
+        <w:rPr>
+          <w:sz w:val="20"/>
+          <w:szCs w:val="20"/>
+        </w:rPr>
+        <w:t>.</w:t>
+      </w:r>
+    </w:p>
+  </w:comment>
+  <w:comment w:id="8" w:author="Oscar Pearce" w:date="2025-10-05T15:49:00Z" w:initials="OP">
     <w:p>
       <w:r>
         <w:rPr>
@@ -3999,7 +4243,7 @@
         </w:rPr>
         <w:t xml:space="preserve">See CISG Advisory Council Opinion No 1 for the further extension of "writing" to include electronic communication: </w:t>
       </w:r>
-      <w:hyperlink r:id="rId6" w:history="1">
+      <w:hyperlink r:id="rId10" w:history="1">
         <w:r>
           <w:rPr>
             <w:rStyle w:val="Hyperlink"/>
@@ -4018,7 +4262,7 @@
       </w:r>
     </w:p>
   </w:comment>
-  <w:comment w:id="6" w:author="Oscar Pearce" w:date="2025-10-05T15:52:00Z" w:initials="OP">
+  <w:comment w:id="9" w:author="Oscar Pearce" w:date="2025-10-05T15:52:00Z" w:initials="OP">
     <w:p>
       <w:r>
         <w:rPr>
@@ -4031,11 +4275,28 @@
           <w:sz w:val="20"/>
           <w:szCs w:val="20"/>
         </w:rPr>
-        <w:t>[19]</w:t>
+        <w:t xml:space="preserve">See CISG Advisory Council Opinion No 19 for analysis of this provision: </w:t>
+      </w:r>
+      <w:hyperlink r:id="rId11" w:history="1">
+        <w:r>
+          <w:rPr>
+            <w:rStyle w:val="Hyperlink"/>
+            <w:sz w:val="20"/>
+            <w:szCs w:val="20"/>
+          </w:rPr>
+          <w:t>https://cisgac.com/opinions/cisgac-opinion-no-19/</w:t>
+        </w:r>
+      </w:hyperlink>
+      <w:r>
+        <w:rPr>
+          <w:sz w:val="20"/>
+          <w:szCs w:val="20"/>
+        </w:rPr>
+        <w:t>.</w:t>
       </w:r>
     </w:p>
   </w:comment>
-  <w:comment w:id="7" w:author="Oscar Pearce" w:date="2025-10-05T15:52:00Z" w:initials="OP">
+  <w:comment w:id="10" w:author="Oscar Pearce" w:date="2025-10-05T15:52:00Z" w:initials="OP">
     <w:p>
       <w:r>
         <w:rPr>
@@ -4050,7 +4311,7 @@
         </w:rPr>
         <w:t xml:space="preserve">See also CISG Advisory Council Opinion No 5 for a discussion of the criteria required for non-conformity to amount to a fundamental breach creating a right of avoidance: </w:t>
       </w:r>
-      <w:hyperlink r:id="rId7" w:history="1">
+      <w:hyperlink r:id="rId12" w:history="1">
         <w:r>
           <w:rPr>
             <w:rStyle w:val="Hyperlink"/>
@@ -4069,7 +4330,7 @@
       </w:r>
     </w:p>
   </w:comment>
-  <w:comment w:id="8" w:author="Oscar Pearce" w:date="2025-10-04T16:27:00Z" w:initials="OP">
+  <w:comment w:id="11" w:author="Oscar Pearce" w:date="2025-10-04T16:27:00Z" w:initials="OP">
     <w:p>
       <w:r>
         <w:rPr>
@@ -4082,9 +4343,9 @@
           <w:sz w:val="20"/>
           <w:szCs w:val="20"/>
         </w:rPr>
-        <w:t xml:space="preserve">See CISG Advisory Council Opinion No 2 for a comprehensive analysis of these provisions: </w:t>
-      </w:r>
-      <w:hyperlink r:id="rId8" w:history="1">
+        <w:t xml:space="preserve">See CISG Advisory Council Opinion No 2 for analysis of these provisions: </w:t>
+      </w:r>
+      <w:hyperlink r:id="rId13" w:history="1">
         <w:r>
           <w:rPr>
             <w:rStyle w:val="Hyperlink"/>
@@ -4103,7 +4364,75 @@
       </w:r>
     </w:p>
   </w:comment>
-  <w:comment w:id="9" w:author="Oscar Pearce" w:date="2025-10-05T15:52:00Z" w:initials="OP">
+  <w:comment w:id="12" w:author="Oscar Pearce" w:date="2025-10-05T16:43:00Z" w:initials="OP">
+    <w:p>
+      <w:r>
+        <w:rPr>
+          <w:rStyle w:val="CommentReference"/>
+        </w:rPr>
+        <w:annotationRef/>
+      </w:r>
+      <w:r>
+        <w:rPr>
+          <w:sz w:val="20"/>
+          <w:szCs w:val="20"/>
+        </w:rPr>
+        <w:t xml:space="preserve">See CISG Advisory Council Opinion No 22 for analysis of this provision: </w:t>
+      </w:r>
+      <w:hyperlink r:id="rId14" w:history="1">
+        <w:r>
+          <w:rPr>
+            <w:rStyle w:val="Hyperlink"/>
+            <w:sz w:val="20"/>
+            <w:szCs w:val="20"/>
+          </w:rPr>
+          <w:t>https://cisgac.com/opinions/cisgac-opinion-no-22/</w:t>
+        </w:r>
+      </w:hyperlink>
+      <w:r>
+        <w:rPr>
+          <w:sz w:val="20"/>
+          <w:szCs w:val="20"/>
+        </w:rPr>
+        <w:t>.</w:t>
+      </w:r>
+    </w:p>
+  </w:comment>
+  <w:comment w:id="13" w:author="Oscar Pearce" w:date="2025-10-05T16:42:00Z" w:initials="OP">
+    <w:p>
+      <w:r>
+        <w:rPr>
+          <w:rStyle w:val="CommentReference"/>
+        </w:rPr>
+        <w:annotationRef/>
+      </w:r>
+      <w:r>
+        <w:rPr>
+          <w:sz w:val="20"/>
+          <w:szCs w:val="20"/>
+        </w:rPr>
+        <w:t xml:space="preserve">See CISG Advisory Council Opinion No 21 for analysis of these provisions: </w:t>
+      </w:r>
+      <w:hyperlink r:id="rId15" w:history="1">
+        <w:r>
+          <w:rPr>
+            <w:rStyle w:val="Hyperlink"/>
+            <w:sz w:val="20"/>
+            <w:szCs w:val="20"/>
+          </w:rPr>
+          <w:t>https://cisgac.com/opinions/cisgac-opinion-no-21/</w:t>
+        </w:r>
+      </w:hyperlink>
+      <w:r>
+        <w:rPr>
+          <w:sz w:val="20"/>
+          <w:szCs w:val="20"/>
+        </w:rPr>
+        <w:t>.</w:t>
+      </w:r>
+    </w:p>
+  </w:comment>
+  <w:comment w:id="15" w:author="Oscar Pearce" w:date="2025-10-05T15:52:00Z" w:initials="OP">
     <w:p>
       <w:r>
         <w:rPr>
@@ -4118,7 +4447,7 @@
         </w:rPr>
         <w:t xml:space="preserve">See CISG Advisory Council Opinion No 5 for a discussion of the criteria required for non-conformity to amount to a fundamental breach: </w:t>
       </w:r>
-      <w:hyperlink r:id="rId9" w:history="1">
+      <w:hyperlink r:id="rId16" w:history="1">
         <w:r>
           <w:rPr>
             <w:rStyle w:val="Hyperlink"/>
@@ -4137,7 +4466,7 @@
       </w:r>
     </w:p>
   </w:comment>
-  <w:comment w:id="10" w:author="Oscar Pearce" w:date="2025-10-05T15:53:00Z" w:initials="OP">
+  <w:comment w:id="14" w:author="Oscar Pearce" w:date="2025-10-05T15:58:00Z" w:initials="OP">
     <w:p>
       <w:r>
         <w:rPr>
@@ -4150,9 +4479,111 @@
           <w:sz w:val="20"/>
           <w:szCs w:val="20"/>
         </w:rPr>
-        <w:t xml:space="preserve">See CISG Advisory Council Opinion No 6 for a comprehensive analysis of this provision: </w:t>
-      </w:r>
-      <w:hyperlink r:id="rId10" w:history="1">
+        <w:t xml:space="preserve">For the effects of avoidance, see CISG Advisory Council Opinion No 9: </w:t>
+      </w:r>
+      <w:hyperlink r:id="rId17" w:history="1">
+        <w:r>
+          <w:rPr>
+            <w:rStyle w:val="Hyperlink"/>
+            <w:sz w:val="20"/>
+            <w:szCs w:val="20"/>
+          </w:rPr>
+          <w:t>https://cisgac.com/opinions/cisgac-opinion-no-9/</w:t>
+        </w:r>
+      </w:hyperlink>
+      <w:r>
+        <w:rPr>
+          <w:sz w:val="20"/>
+          <w:szCs w:val="20"/>
+        </w:rPr>
+        <w:t>.</w:t>
+      </w:r>
+    </w:p>
+  </w:comment>
+  <w:comment w:id="16" w:author="Oscar Pearce" w:date="2025-10-05T16:20:00Z" w:initials="OP">
+    <w:p>
+      <w:r>
+        <w:rPr>
+          <w:rStyle w:val="CommentReference"/>
+        </w:rPr>
+        <w:annotationRef/>
+      </w:r>
+      <w:r>
+        <w:rPr>
+          <w:sz w:val="20"/>
+          <w:szCs w:val="20"/>
+        </w:rPr>
+        <w:t xml:space="preserve">Regarding documents controlling goods' disposition, see CISG Advisory Council Opinion No 11: </w:t>
+      </w:r>
+      <w:hyperlink r:id="rId18" w:history="1">
+        <w:r>
+          <w:rPr>
+            <w:rStyle w:val="Hyperlink"/>
+            <w:sz w:val="20"/>
+            <w:szCs w:val="20"/>
+          </w:rPr>
+          <w:t>https://cisgac.com/opinions/cisgac-opinion-no-11/</w:t>
+        </w:r>
+      </w:hyperlink>
+      <w:r>
+        <w:rPr>
+          <w:sz w:val="20"/>
+          <w:szCs w:val="20"/>
+        </w:rPr>
+        <w:t>.</w:t>
+      </w:r>
+    </w:p>
+  </w:comment>
+  <w:comment w:id="17" w:author="Oscar Pearce" w:date="2025-10-05T15:58:00Z" w:initials="OP">
+    <w:p>
+      <w:r>
+        <w:rPr>
+          <w:rStyle w:val="CommentReference"/>
+        </w:rPr>
+        <w:annotationRef/>
+      </w:r>
+      <w:r>
+        <w:rPr>
+          <w:sz w:val="20"/>
+          <w:szCs w:val="20"/>
+        </w:rPr>
+        <w:t xml:space="preserve">For the effects of avoidance, see CISG Advisory Council Opinion No 9: </w:t>
+      </w:r>
+      <w:hyperlink r:id="rId19" w:history="1">
+        <w:r>
+          <w:rPr>
+            <w:rStyle w:val="Hyperlink"/>
+            <w:sz w:val="20"/>
+            <w:szCs w:val="20"/>
+          </w:rPr>
+          <w:t>https://cisgac.com/opinions/cisgac-opinion-no-9/</w:t>
+        </w:r>
+      </w:hyperlink>
+      <w:r>
+        <w:rPr>
+          <w:sz w:val="20"/>
+          <w:szCs w:val="20"/>
+        </w:rPr>
+        <w:t>.</w:t>
+      </w:r>
+    </w:p>
+  </w:comment>
+  <w:comment w:id="18" w:author="Oscar Pearce" w:date="2025-10-05T15:53:00Z" w:initials="OP">
+    <w:p>
+      <w:r>
+        <w:rPr>
+          <w:rStyle w:val="CommentReference"/>
+        </w:rPr>
+        <w:annotationRef/>
+      </w:r>
+      <w:r>
+        <w:rPr>
+          <w:sz w:val="20"/>
+          <w:szCs w:val="20"/>
+        </w:rPr>
+        <w:t xml:space="preserve">See CISG Advisory Council Opinion No 6 for analysis of this provision: </w:t>
+      </w:r>
+      <w:hyperlink r:id="rId20" w:history="1">
         <w:r>
           <w:rPr>
             <w:rStyle w:val="Hyperlink"/>
@@ -4171,6 +4602,193 @@
       </w:r>
     </w:p>
   </w:comment>
+  <w:comment w:id="19" w:author="Oscar Pearce" w:date="2025-10-05T15:56:00Z" w:initials="OP">
+    <w:p>
+      <w:r>
+        <w:rPr>
+          <w:rStyle w:val="CommentReference"/>
+        </w:rPr>
+        <w:annotationRef/>
+      </w:r>
+      <w:r>
+        <w:rPr>
+          <w:sz w:val="20"/>
+          <w:szCs w:val="20"/>
+        </w:rPr>
+        <w:t xml:space="preserve">See CISG Advisory Council Opinion No 8 for analysis of these provisions: </w:t>
+      </w:r>
+      <w:hyperlink r:id="rId21" w:history="1">
+        <w:r>
+          <w:rPr>
+            <w:rStyle w:val="Hyperlink"/>
+            <w:sz w:val="20"/>
+            <w:szCs w:val="20"/>
+          </w:rPr>
+          <w:t>https://cisgac.com/opinions/cisgac-opinion-no-8/</w:t>
+        </w:r>
+      </w:hyperlink>
+      <w:r>
+        <w:rPr>
+          <w:sz w:val="20"/>
+          <w:szCs w:val="20"/>
+        </w:rPr>
+        <w:t>.</w:t>
+      </w:r>
+    </w:p>
+  </w:comment>
+  <w:comment w:id="20" w:author="Oscar Pearce" w:date="2025-10-05T16:30:00Z" w:initials="OP">
+    <w:p>
+      <w:r>
+        <w:rPr>
+          <w:rStyle w:val="CommentReference"/>
+        </w:rPr>
+        <w:annotationRef/>
+      </w:r>
+      <w:r>
+        <w:rPr>
+          <w:sz w:val="20"/>
+          <w:szCs w:val="20"/>
+        </w:rPr>
+        <w:t xml:space="preserve">See CISG Advisory Council Opinion No 14 for analysis of this provision: </w:t>
+      </w:r>
+      <w:hyperlink r:id="rId22" w:history="1">
+        <w:r>
+          <w:rPr>
+            <w:rStyle w:val="Hyperlink"/>
+            <w:sz w:val="20"/>
+            <w:szCs w:val="20"/>
+          </w:rPr>
+          <w:t>https://cisgac.com/opinions/cisgac-opinion-no-14/</w:t>
+        </w:r>
+      </w:hyperlink>
+      <w:r>
+        <w:rPr>
+          <w:sz w:val="20"/>
+          <w:szCs w:val="20"/>
+        </w:rPr>
+        <w:t>.</w:t>
+      </w:r>
+    </w:p>
+  </w:comment>
+  <w:comment w:id="21" w:author="Oscar Pearce" w:date="2025-10-05T15:55:00Z" w:initials="OP">
+    <w:p>
+      <w:r>
+        <w:rPr>
+          <w:rStyle w:val="CommentReference"/>
+        </w:rPr>
+        <w:annotationRef/>
+      </w:r>
+      <w:r>
+        <w:rPr>
+          <w:sz w:val="20"/>
+          <w:szCs w:val="20"/>
+        </w:rPr>
+        <w:t xml:space="preserve">See CISG Advisory Council Opinion Nos 7 and 20 for analysis of this provision: </w:t>
+      </w:r>
+      <w:hyperlink r:id="rId23" w:history="1">
+        <w:r>
+          <w:rPr>
+            <w:rStyle w:val="Hyperlink"/>
+            <w:sz w:val="20"/>
+            <w:szCs w:val="20"/>
+          </w:rPr>
+          <w:t>https://cisgac.com/opinions/cisgac-opinion-no-7/</w:t>
+        </w:r>
+      </w:hyperlink>
+      <w:r>
+        <w:rPr>
+          <w:sz w:val="20"/>
+          <w:szCs w:val="20"/>
+        </w:rPr>
+        <w:t xml:space="preserve">, </w:t>
+      </w:r>
+      <w:hyperlink r:id="rId24" w:history="1">
+        <w:r>
+          <w:rPr>
+            <w:rStyle w:val="Hyperlink"/>
+            <w:sz w:val="20"/>
+            <w:szCs w:val="20"/>
+          </w:rPr>
+          <w:t>https://cisgac.com/opinions/cisgac-opinion-no-20/</w:t>
+        </w:r>
+      </w:hyperlink>
+      <w:r>
+        <w:rPr>
+          <w:sz w:val="20"/>
+          <w:szCs w:val="20"/>
+        </w:rPr>
+        <w:t>.</w:t>
+      </w:r>
+    </w:p>
+  </w:comment>
+  <w:comment w:id="22" w:author="Oscar Pearce" w:date="2025-10-05T16:00:00Z" w:initials="OP">
+    <w:p>
+      <w:r>
+        <w:rPr>
+          <w:rStyle w:val="CommentReference"/>
+        </w:rPr>
+        <w:annotationRef/>
+      </w:r>
+      <w:r>
+        <w:rPr>
+          <w:sz w:val="20"/>
+          <w:szCs w:val="20"/>
+        </w:rPr>
+        <w:t xml:space="preserve">For analysis of this restitutionary obligation, see CISG Advisory Council Opinion No 9: </w:t>
+      </w:r>
+      <w:hyperlink r:id="rId25" w:history="1">
+        <w:r>
+          <w:rPr>
+            <w:rStyle w:val="Hyperlink"/>
+            <w:sz w:val="20"/>
+            <w:szCs w:val="20"/>
+          </w:rPr>
+          <w:t>https://cisgac.com/opinions/cisgac-opinion-no-9/</w:t>
+        </w:r>
+      </w:hyperlink>
+      <w:r>
+        <w:rPr>
+          <w:sz w:val="20"/>
+          <w:szCs w:val="20"/>
+        </w:rPr>
+        <w:t>.</w:t>
+      </w:r>
+    </w:p>
+  </w:comment>
+  <w:comment w:id="23" w:author="Oscar Pearce" w:date="2025-10-05T16:32:00Z" w:initials="OP">
+    <w:p>
+      <w:r>
+        <w:rPr>
+          <w:rStyle w:val="CommentReference"/>
+        </w:rPr>
+        <w:annotationRef/>
+      </w:r>
+      <w:r>
+        <w:rPr>
+          <w:sz w:val="20"/>
+          <w:szCs w:val="20"/>
+        </w:rPr>
+        <w:t xml:space="preserve">See CISG Advisory Council Opinion No 15 for analysis of these provisions: </w:t>
+      </w:r>
+      <w:hyperlink r:id="rId26" w:history="1">
+        <w:r>
+          <w:rPr>
+            <w:rStyle w:val="Hyperlink"/>
+            <w:sz w:val="20"/>
+            <w:szCs w:val="20"/>
+          </w:rPr>
+          <w:t>https://cisgac.com/opinions/cisgac-opinion-no-15/</w:t>
+        </w:r>
+      </w:hyperlink>
+      <w:r>
+        <w:rPr>
+          <w:sz w:val="20"/>
+          <w:szCs w:val="20"/>
+        </w:rPr>
+        <w:t>.</w:t>
+      </w:r>
+    </w:p>
+  </w:comment>
 </w:comments>
 </file>
 
@@ -4178,15 +4796,28 @@
 <w15:commentsEx xmlns:wpc="http://schemas.microsoft.com/office/word/2010/wordprocessingCanvas" xmlns:cx="http://schemas.microsoft.com/office/drawing/2014/chartex" xmlns:cx1="http://schemas.microsoft.com/office/drawing/2015/9/8/chartex" xmlns:cx2="http://schemas.microsoft.com/office/drawing/2015/10/21/chartex" xmlns:cx3="http://schemas.microsoft.com/office/drawing/2016/5/9/chartex" xmlns:cx4="http://schemas.microsoft.com/office/drawing/2016/5/10/chartex" xmlns:cx5="http://schemas.microsoft.com/office/drawing/2016/5/11/chartex" xmlns:cx6="http://schemas.microsoft.com/office/drawing/2016/5/12/chartex" xmlns:cx7="http://schemas.microsoft.com/office/drawing/2016/5/13/chartex" xmlns:cx8="http://schemas.microsoft.com/office/drawing/2016/5/14/chartex" xmlns:mc="http://schemas.openxmlformats.org/markup-compatibility/2006" xmlns:aink="http://schemas.microsoft.com/office/drawing/2016/ink" xmlns:am3d="http://schemas.microsoft.com/office/drawing/2017/model3d" xmlns:o="urn:schemas-microsoft-com:office:office" xmlns:oel="http://schemas.microsoft.com/office/2019/extlst" xmlns:r="http://schemas.openxmlformats.org/officeDocument/2006/relationships" xmlns:m="http://schemas.openxmlformats.org/officeDocument/2006/math" xmlns:v="urn:schemas-microsoft-com:vml" xmlns:wp14="http://schemas.microsoft.com/office/word/2010/wordprocessingDrawing" xmlns:wp="http://schemas.openxmlformats.org/drawingml/2006/wordprocessingDrawing" xmlns:w10="urn:schemas-microsoft-com:office:word" xmlns:w="http://schemas.openxmlformats.org/wordprocessingml/2006/main" xmlns:w14="http://schemas.microsoft.com/office/word/2010/wordml" xmlns:w15="http://schemas.microsoft.com/office/word/2012/wordml" xmlns:w16cex="http://schemas.microsoft.com/office/word/2018/wordml/cex" xmlns:w16cid="http://schemas.microsoft.com/office/word/2016/wordml/cid" xmlns:w16="http://schemas.microsoft.com/office/word/2018/wordml" xmlns:w16du="http://schemas.microsoft.com/office/word/2023/wordml/word16du" xmlns:w16sdtdh="http://schemas.microsoft.com/office/word/2020/wordml/sdtdatahash" xmlns:w16sdtfl="http://schemas.microsoft.com/office/word/2024/wordml/sdtformatlock" xmlns:w16se="http://schemas.microsoft.com/office/word/2015/wordml/symex" xmlns:wpg="http://schemas.microsoft.com/office/word/2010/wordprocessingGroup" xmlns:wpi="http://schemas.microsoft.com/office/word/2010/wordprocessingInk" xmlns:wne="http://schemas.microsoft.com/office/word/2006/wordml" xmlns:wps="http://schemas.microsoft.com/office/word/2010/wordprocessingShape" mc:Ignorable="w14 w15 w16se w16cid w16 w16cex w16sdtdh w16sdtfl w16du wp14">
   <w15:commentEx w15:paraId="332714E0" w15:done="0"/>
   <w15:commentEx w15:paraId="69C9008F" w15:done="0"/>
+  <w15:commentEx w15:paraId="29A2396D" w15:done="0"/>
   <w15:commentEx w15:paraId="15798C36" w15:done="0"/>
   <w15:commentEx w15:paraId="026A144A" w15:paraIdParent="15798C36" w15:done="0"/>
+  <w15:commentEx w15:paraId="2E1CBF49" w15:paraIdParent="15798C36" w15:done="0"/>
   <w15:commentEx w15:paraId="54A93DE9" w15:done="0"/>
+  <w15:commentEx w15:paraId="5C7B437C" w15:done="0"/>
   <w15:commentEx w15:paraId="167B32F1" w15:done="0"/>
   <w15:commentEx w15:paraId="6D1B7673" w15:done="0"/>
   <w15:commentEx w15:paraId="684CDBA5" w15:paraIdParent="6D1B7673" w15:done="0"/>
   <w15:commentEx w15:paraId="687E6E52" w15:done="0"/>
+  <w15:commentEx w15:paraId="403DFC46" w15:done="0"/>
+  <w15:commentEx w15:paraId="7C643EE0" w15:done="0"/>
   <w15:commentEx w15:paraId="74FAE5DA" w15:done="0"/>
+  <w15:commentEx w15:paraId="127C2A47" w15:done="0"/>
+  <w15:commentEx w15:paraId="2F99F090" w15:done="0"/>
+  <w15:commentEx w15:paraId="62D684B4" w15:done="0"/>
   <w15:commentEx w15:paraId="6E863AC0" w15:done="0"/>
+  <w15:commentEx w15:paraId="74D3B854" w15:done="0"/>
+  <w15:commentEx w15:paraId="4A64EB1E" w15:done="0"/>
+  <w15:commentEx w15:paraId="7219A9D3" w15:done="0"/>
+  <w15:commentEx w15:paraId="62B21185" w15:done="0"/>
+  <w15:commentEx w15:paraId="5F5FB06E" w15:done="0"/>
 </w15:commentsEx>
 </file>
 
@@ -4194,15 +4825,28 @@
 <w16cex:commentsExtensible xmlns:wpc="http://schemas.microsoft.com/office/word/2010/wordprocessingCanvas" xmlns:cx="http://schemas.microsoft.com/office/drawing/2014/chartex" xmlns:cx1="http://schemas.microsoft.com/office/drawing/2015/9/8/chartex" xmlns:cx2="http://schemas.microsoft.com/office/drawing/2015/10/21/chartex" xmlns:cx3="http://schemas.microsoft.com/office/drawing/2016/5/9/chartex" xmlns:cx4="http://schemas.microsoft.com/office/drawing/2016/5/10/chartex" xmlns:cx5="http://schemas.microsoft.com/office/drawing/2016/5/11/chartex" xmlns:cx6="http://schemas.microsoft.com/office/drawing/2016/5/12/chartex" xmlns:cx7="http://schemas.microsoft.com/office/drawing/2016/5/13/chartex" xmlns:cx8="http://schemas.microsoft.com/office/drawing/2016/5/14/chartex" xmlns:cr="http://schemas.microsoft.com/office/comments/2020/reactions" xmlns:mc="http://schemas.openxmlformats.org/markup-compatibility/2006" xmlns:aink="http://schemas.microsoft.com/office/drawing/2016/ink" xmlns:am3d="http://schemas.microsoft.com/office/drawing/2017/model3d" xmlns:o="urn:schemas-microsoft-com:office:office" xmlns:oel="http://schemas.microsoft.com/office/2019/extlst" xmlns:r="http://schemas.openxmlformats.org/officeDocument/2006/relationships" xmlns:m="http://schemas.openxmlformats.org/officeDocument/2006/math" xmlns:v="urn:schemas-microsoft-com:vml" xmlns:wp14="http://schemas.microsoft.com/office/word/2010/wordprocessingDrawing" xmlns:wp="http://schemas.openxmlformats.org/drawingml/2006/wordprocessingDrawing" xmlns:w10="urn:schemas-microsoft-com:office:word" xmlns:w="http://schemas.openxmlformats.org/wordprocessingml/2006/main" xmlns:w14="http://schemas.microsoft.com/office/word/2010/wordml" xmlns:w15="http://schemas.microsoft.com/office/word/2012/wordml" xmlns:w16cex="http://schemas.microsoft.com/office/word/2018/wordml/cex" xmlns:w16cid="http://schemas.microsoft.com/office/word/2016/wordml/cid" xmlns:w16="http://schemas.microsoft.com/office/word/2018/wordml" xmlns:w16du="http://schemas.microsoft.com/office/word/2023/wordml/word16du" xmlns:w16sdtdh="http://schemas.microsoft.com/office/word/2020/wordml/sdtdatahash" xmlns:w16sdtfl="http://schemas.microsoft.com/office/word/2024/wordml/sdtformatlock" xmlns:w16se="http://schemas.microsoft.com/office/word/2015/wordml/symex" xmlns:wpg="http://schemas.microsoft.com/office/word/2010/wordprocessingGroup" xmlns:wpi="http://schemas.microsoft.com/office/word/2010/wordprocessingInk" xmlns:wne="http://schemas.microsoft.com/office/word/2006/wordml" xmlns:wps="http://schemas.microsoft.com/office/word/2010/wordprocessingShape" mc:Ignorable="w14 w15 w16se w16cid w16 w16cex w16sdtdh w16sdtfl cr w16du wp14">
   <w16cex:commentExtensible w16cex:durableId="59C8E37A" w16cex:dateUtc="2025-10-04T05:25:00Z"/>
   <w16cex:commentExtensible w16cex:durableId="25B206B4" w16cex:dateUtc="2025-10-04T05:18:00Z"/>
+  <w16cex:commentExtensible w16cex:durableId="5316D471" w16cex:dateUtc="2025-10-05T05:28:00Z"/>
   <w16cex:commentExtensible w16cex:durableId="21E06797" w16cex:dateUtc="2025-10-05T04:42:00Z"/>
   <w16cex:commentExtensible w16cex:durableId="288364BD" w16cex:dateUtc="2025-10-05T04:42:00Z"/>
+  <w16cex:commentExtensible w16cex:durableId="3EF54363" w16cex:dateUtc="2025-10-05T05:34:00Z"/>
   <w16cex:commentExtensible w16cex:durableId="04BDA365" w16cex:dateUtc="2025-10-05T04:47:00Z"/>
+  <w16cex:commentExtensible w16cex:durableId="4BAFEB15" w16cex:dateUtc="2025-10-05T05:52:00Z"/>
   <w16cex:commentExtensible w16cex:durableId="78727D23" w16cex:dateUtc="2025-10-05T04:49:00Z"/>
   <w16cex:commentExtensible w16cex:durableId="521AF3BD" w16cex:dateUtc="2025-10-05T04:52:00Z"/>
   <w16cex:commentExtensible w16cex:durableId="25E83FAC" w16cex:dateUtc="2025-10-05T04:52:00Z"/>
   <w16cex:commentExtensible w16cex:durableId="5C65860E" w16cex:dateUtc="2025-10-04T06:27:00Z"/>
+  <w16cex:commentExtensible w16cex:durableId="5DFD090B" w16cex:dateUtc="2025-10-05T05:43:00Z"/>
+  <w16cex:commentExtensible w16cex:durableId="7DDF81EC" w16cex:dateUtc="2025-10-05T05:42:00Z"/>
   <w16cex:commentExtensible w16cex:durableId="75A4D186" w16cex:dateUtc="2025-10-05T04:52:00Z"/>
+  <w16cex:commentExtensible w16cex:durableId="1E1B9076" w16cex:dateUtc="2025-10-05T04:58:00Z"/>
+  <w16cex:commentExtensible w16cex:durableId="291D2925" w16cex:dateUtc="2025-10-05T05:20:00Z"/>
+  <w16cex:commentExtensible w16cex:durableId="020DBA87" w16cex:dateUtc="2025-10-05T04:58:00Z"/>
   <w16cex:commentExtensible w16cex:durableId="5FB4EFCC" w16cex:dateUtc="2025-10-05T04:53:00Z"/>
+  <w16cex:commentExtensible w16cex:durableId="3B515C88" w16cex:dateUtc="2025-10-05T04:56:00Z"/>
+  <w16cex:commentExtensible w16cex:durableId="75523A41" w16cex:dateUtc="2025-10-05T05:30:00Z"/>
+  <w16cex:commentExtensible w16cex:durableId="39D64D3D" w16cex:dateUtc="2025-10-05T04:55:00Z"/>
+  <w16cex:commentExtensible w16cex:durableId="144D5E0A" w16cex:dateUtc="2025-10-05T05:00:00Z"/>
+  <w16cex:commentExtensible w16cex:durableId="7ACF5AF5" w16cex:dateUtc="2025-10-05T05:32:00Z"/>
 </w16cex:commentsExtensible>
 </file>
 
@@ -4210,15 +4854,28 @@
 <w16cid:commentsIds xmlns:wpc="http://schemas.microsoft.com/office/word/2010/wordprocessingCanvas" xmlns:cx="http://schemas.microsoft.com/office/drawing/2014/chartex" xmlns:cx1="http://schemas.microsoft.com/office/drawing/2015/9/8/chartex" xmlns:cx2="http://schemas.microsoft.com/office/drawing/2015/10/21/chartex" xmlns:cx3="http://schemas.microsoft.com/office/drawing/2016/5/9/chartex" xmlns:cx4="http://schemas.microsoft.com/office/drawing/2016/5/10/chartex" xmlns:cx5="http://schemas.microsoft.com/office/drawing/2016/5/11/chartex" xmlns:cx6="http://schemas.microsoft.com/office/drawing/2016/5/12/chartex" xmlns:cx7="http://schemas.microsoft.com/office/drawing/2016/5/13/chartex" xmlns:cx8="http://schemas.microsoft.com/office/drawing/2016/5/14/chartex" xmlns:mc="http://schemas.openxmlformats.org/markup-compatibility/2006" xmlns:aink="http://schemas.microsoft.com/office/drawing/2016/ink" xmlns:am3d="http://schemas.microsoft.com/office/drawing/2017/model3d" xmlns:o="urn:schemas-microsoft-com:office:office" xmlns:oel="http://schemas.microsoft.com/office/2019/extlst" xmlns:r="http://schemas.openxmlformats.org/officeDocument/2006/relationships" xmlns:m="http://schemas.openxmlformats.org/officeDocument/2006/math" xmlns:v="urn:schemas-microsoft-com:vml" xmlns:wp14="http://schemas.microsoft.com/office/word/2010/wordprocessingDrawing" xmlns:wp="http://schemas.openxmlformats.org/drawingml/2006/wordprocessingDrawing" xmlns:w10="urn:schemas-microsoft-com:office:word" xmlns:w="http://schemas.openxmlformats.org/wordprocessingml/2006/main" xmlns:w14="http://schemas.microsoft.com/office/word/2010/wordml" xmlns:w15="http://schemas.microsoft.com/office/word/2012/wordml" xmlns:w16cex="http://schemas.microsoft.com/office/word/2018/wordml/cex" xmlns:w16cid="http://schemas.microsoft.com/office/word/2016/wordml/cid" xmlns:w16="http://schemas.microsoft.com/office/word/2018/wordml" xmlns:w16du="http://schemas.microsoft.com/office/word/2023/wordml/word16du" xmlns:w16sdtdh="http://schemas.microsoft.com/office/word/2020/wordml/sdtdatahash" xmlns:w16sdtfl="http://schemas.microsoft.com/office/word/2024/wordml/sdtformatlock" xmlns:w16se="http://schemas.microsoft.com/office/word/2015/wordml/symex" xmlns:wpg="http://schemas.microsoft.com/office/word/2010/wordprocessingGroup" xmlns:wpi="http://schemas.microsoft.com/office/word/2010/wordprocessingInk" xmlns:wne="http://schemas.microsoft.com/office/word/2006/wordml" xmlns:wps="http://schemas.microsoft.com/office/word/2010/wordprocessingShape" mc:Ignorable="w14 w15 w16se w16cid w16 w16cex w16sdtdh w16sdtfl w16du wp14">
   <w16cid:commentId w16cid:paraId="332714E0" w16cid:durableId="59C8E37A"/>
   <w16cid:commentId w16cid:paraId="69C9008F" w16cid:durableId="25B206B4"/>
+  <w16cid:commentId w16cid:paraId="29A2396D" w16cid:durableId="5316D471"/>
   <w16cid:commentId w16cid:paraId="15798C36" w16cid:durableId="21E06797"/>
   <w16cid:commentId w16cid:paraId="026A144A" w16cid:durableId="288364BD"/>
+  <w16cid:commentId w16cid:paraId="2E1CBF49" w16cid:durableId="3EF54363"/>
   <w16cid:commentId w16cid:paraId="54A93DE9" w16cid:durableId="04BDA365"/>
+  <w16cid:commentId w16cid:paraId="5C7B437C" w16cid:durableId="4BAFEB15"/>
   <w16cid:commentId w16cid:paraId="167B32F1" w16cid:durableId="78727D23"/>
   <w16cid:commentId w16cid:paraId="6D1B7673" w16cid:durableId="521AF3BD"/>
   <w16cid:commentId w16cid:paraId="684CDBA5" w16cid:durableId="25E83FAC"/>
   <w16cid:commentId w16cid:paraId="687E6E52" w16cid:durableId="5C65860E"/>
+  <w16cid:commentId w16cid:paraId="403DFC46" w16cid:durableId="5DFD090B"/>
+  <w16cid:commentId w16cid:paraId="7C643EE0" w16cid:durableId="7DDF81EC"/>
   <w16cid:commentId w16cid:paraId="74FAE5DA" w16cid:durableId="75A4D186"/>
+  <w16cid:commentId w16cid:paraId="127C2A47" w16cid:durableId="1E1B9076"/>
+  <w16cid:commentId w16cid:paraId="2F99F090" w16cid:durableId="291D2925"/>
+  <w16cid:commentId w16cid:paraId="62D684B4" w16cid:durableId="020DBA87"/>
   <w16cid:commentId w16cid:paraId="6E863AC0" w16cid:durableId="5FB4EFCC"/>
+  <w16cid:commentId w16cid:paraId="74D3B854" w16cid:durableId="3B515C88"/>
+  <w16cid:commentId w16cid:paraId="4A64EB1E" w16cid:durableId="75523A41"/>
+  <w16cid:commentId w16cid:paraId="7219A9D3" w16cid:durableId="39D64D3D"/>
+  <w16cid:commentId w16cid:paraId="62B21185" w16cid:durableId="144D5E0A"/>
+  <w16cid:commentId w16cid:paraId="5F5FB06E" w16cid:durableId="7ACF5AF5"/>
 </w16cid:commentsIds>
 </file>
 

</xml_diff>